<commit_message>
v0.6: full-DILIst same-drug comparison (Table 5), benchmark-vs-official snapshot discrepancies, extended manifest and README
</commit_message>
<xml_diff>
--- a/submission_docx/manuscript.docx
+++ b/submission_docx/manuscript.docx
@@ -21,7 +21,7 @@
         <w:rPr>
           <w:i/>
         </w:rPr>
-        <w:t>Draft v0.5 — research note / data note. Not yet submission-ready. All numeric claims below are reproduced from local data by `repro/generate_analysis.py` (see Data availability). No new model was trained and no label was modified. Revision v0.4→v0.5: title and Introduction narrowed to match the evidence actually shown — the audit quantifies source-dependent binary labeling of the ambiguous class across two disjoint channels, not same-drug cross-source label conflicts; the "all disagreement confined to the ambiguous class" claim is now explicitly scoped to the Tier-B primary analysis; the Abstract restates the 49-reclassification fact in full (all ended in a defined concern category; 18 escalations and 0 downgrades among defined-class transitions).</w:t>
+        <w:t>Draft v0.6 — research note / data note. Not yet submission-ready. All numeric claims below are reproduced from local data by the scripts in `repro/` (see Data availability). No new model was trained and no label was modified. Revision v0.5→v0.6: added a same-drug cross-source comparison across the full official FDA DILIst dataset (new §3.5, Table 5; 836/1,279 drugs matched to DILIrank 1.0); the benchmark's DILIst-sourced subset and the full official DILIst dataset are now reported as distinct objects; two compounds (armodafinil, tretinoin) are shown to be absent from the official DILIst dataset despite appearing as positive DILIst-sourced rows in the benchmark; the "no same-drug comparison" limitation is correspondingly revised.</w:t>
       </w:r>
     </w:p>
     <w:p>
@@ -57,7 +57,7 @@
         <w:t>Methods.</w:t>
       </w:r>
       <w:r>
-        <w:t xml:space="preserve"> We aligned the two U.S. FDA releases of DILIrank (1.0, n = 1,036; 2.0, n = 1,336) by LTKB identifier, and cross-matched the result against the 1,111-compound gold standard of Seal et al. (2024), the publicly released DILIPredictor benchmark, using PubChem InChIKey bridging. Match quality was stratified into full-InChIKey, InChIKey14-only, identity-conflict, and unmatchable, and all cross-source statistics were recomputed under three matching tiers (strict full-InChIKey; full + InChIKey14; and excluding identity conflicts) as a sensitivity analysis. No model was retrained; the only prediction-level evidence is the previously reproduced 223-compound held-out probability vector of the Seal et al. model.</w:t>
+        <w:t xml:space="preserve"> We aligned the two U.S. FDA releases of DILIrank (1.0, n = 1,036; 2.0, n = 1,336) by LTKB identifier, and cross-matched the result against the 1,111-compound gold standard of Seal et al. (2024), the publicly released DILIPredictor benchmark, using PubChem InChIKey bridging. Match quality was stratified into full-InChIKey, InChIKey14-only, identity-conflict, and unmatchable, and all cross-source statistics were recomputed under three matching tiers (strict full-InChIKey; full + InChIKey14; and excluding identity conflicts) as a sensitivity analysis. We further matched the full official FDA DILIst dataset (1,279 drugs) against DILIrank 1.0 for a same-drug comparison. No model was retrained; the only prediction-level evidence is the previously reproduced 223-compound held-out probability vector of the Seal et al. model.</w:t>
       </w:r>
     </w:p>
     <w:p>
@@ -71,7 +71,7 @@
         <w:t>Results.</w:t>
       </w:r>
       <w:r>
-        <w:t xml:space="preserve"> Between versions, 0 drugs were removed and 300 were added; 49 were reclassified. All 49 reclassifications ended in a defined concern category; among transitions between defined concern categories, 18 were escalations (no → less) and none were downgrades. The remaining 31 transitions resolved the ambiguous category to a defined concern category (27 to less, 4 to most). Among 559 DILIst-sourced compounds with a DILIrank-1.0 class, the non-ambiguous classes agree with DILIst (476/476); this agreement is partly definitional, because DILIst was constructed on top of DILIrank with a stated most/less→positive, no→negative rule [2], and we therefore treat it as a consistency check of that rule rather than independent corroboration. The informative pattern is the ambiguous class: in the matched ambiguous subset of the shipped benchmark, 80 DILIrank-1.0-ambiguous drugs carry a negative label in the DILIst-sourced channel and 30 a positive label in the pre-binarized, DILIrank-derived "CP Overlap" channel; the same directional split holds under strict full-InChIKey matching (44 negative / 17 positive). Of the 49 reclassified drugs, 28 fall inside the Seal gold standard (23 train / 5 held-out); the 5 held-out drugs all carry a "less" label in version 2.0 (3 upgraded from no, 2 resolved from ambiguous), and their reproduced DILIPredictor probabilities straddle the published Youden threshold (0.6386): 2 predicted positive, 3 negative, and all five lie within 0.22 of equiprobability.</w:t>
+        <w:t xml:space="preserve"> Between versions, 0 drugs were removed and 300 were added; 49 were reclassified. All 49 reclassifications ended in a defined concern category; among transitions between defined concern categories, 18 were escalations (no → less) and none were downgrades. The remaining 31 transitions resolved the ambiguous category to a defined concern category (27 to less, 4 to most). In the benchmark, among 559 DILIst-sourced compounds with a DILIrank-1.0 class, the non-ambiguous classes agree with DILIst (476/476) — an agreement that is partly definitional, because DILIst was constructed on top of DILIrank with a stated most/less→positive, no→negative rule [2], and we therefore treat it as a consistency check of that rule rather than independent corroboration. The informative pattern is the ambiguous class: in the matched ambiguous subset of the benchmark, 80 DILIrank-1.0-ambiguous drugs carry a negative label in the DILIst-sourced channel and 30 a positive label in the pre-binarized, DILIrank-derived "CP Overlap" channel; the same directional split holds under strict full-InChIKey matching (44 negative / 17 positive). In the full official DILIst dataset, 836 drugs match DILIrank 1.0 at the structure level: the non-ambiguous classes agree in 713/714 cases (the single exception is the norgestrel/levonorgestrel racemate pair), and 122 matched ambiguous drugs carry 120 negative and 2 positive DILIst labels (norethindrone; zopiclone). Two compounds (armodafinil, tretinoin) appear as positive DILIst-sourced rows in the benchmark but are absent from the official DILIst dataset. Of the 49 reclassified drugs, 28 fall inside the Seal gold standard (23 train / 5 held-out); the 5 held-out drugs all carry a "less" label in version 2.0, and their reproduced DILIPredictor probabilities straddle the published Youden threshold (0.6386): 2 predicted positive, 3 negative, and all five lie within 0.22 of equiprobability.</w:t>
       </w:r>
     </w:p>
     <w:p>
@@ -85,7 +85,7 @@
         <w:t>Conclusions.</w:t>
       </w:r>
       <w:r>
-        <w:t xml:space="preserve"> DILI reference-label instability is concentrated in the epistemically uncertain class and is directional in two senses: all 49 reclassifications ended in a defined concern category (with 18 escalations and no downgrades among defined-class transitions), and in a widely used shipped benchmark the ambiguous class carries binary labels that differ in direction between two disjoint source channels (in the matched ambiguous subset: 80 negative via the DILIst-sourced channel, 30 positive via the DILIrank-derived subset). These are descriptive properties of the shipped benchmark, not a same-drug comparison across independent adjudications. Benchmarks should treat the ambiguous class explicitly and report per-drug label provenance instead of silently merging or discarding it. The small number of reclassified held-out compounds (n = 5; n = 2 under strict matching) limits this work to a descriptive audit; larger out-of-fold samples would be needed for inferential claims about model behaviour.</w:t>
+        <w:t xml:space="preserve"> DILI reference-label instability is concentrated in the epistemically uncertain class and is directional in three senses: all 49 reclassifications ended in a defined concern category (18 escalations and no downgrades among defined-class transitions); in a widely used shipped benchmark the ambiguous class carries binary labels that differ in direction between two disjoint source channels; and in the full official DILIst dataset the ambiguous class is labeled negative for 120 of 122 same-drug matched cases, with two named exceptions. The benchmark's DILIst-sourced rows and the official DILIst dataset are not the same object, and two benchmark rows have no counterpart in the official dataset. These are descriptive properties of the shipped data, not claims about label correctness. Benchmarks should treat the ambiguous class explicitly and report per-drug label provenance instead of silently merging or discarding it. The small number of reclassified held-out compounds (n = 5; n = 2 under strict matching) limits this work to a descriptive audit; larger out-of-fold samples would be needed for inferential claims about model behaviour.</w:t>
       </w:r>
     </w:p>
     <w:p>
@@ -144,7 +144,7 @@
         <w:spacing w:line="360" w:lineRule="auto" w:after="120"/>
       </w:pPr>
       <w:r>
-        <w:t>Here we do not build a new database or a new predictor. We audit the labels themselves: (i) how many drugs changed class between DILIrank 1.0 and 2.0, and in which direction; (ii) how compounds classified as ambiguous in DILIrank 1.0 carry binary labels across two disjoint source channels in a published benchmark — the Seal et al. (2024) gold standard [6] — and how the resulting label distribution depends on source provenance; and (iii) what the reclassified compounds that survive into that benchmark's held-out set look like under the reproduced model. Prior work has examined how the choice of features, endpoints, and negative-sample definitions affects reported DILI model performance [7]; to our knowledge, neither the direction of version drift nor the source-dependent binary labeling of DILIrank's ambiguous class has been quantified. Our contribution is therefore limited to two checkable, quantitative facts — the directionally asymmetric reclassification pattern of the 1.0→2.0 update, and the specific path by which compounds classified as ambiguous in DILIrank 1.0 arrive in a published benchmark with binary labels — reported as a descriptive, reproducible characterization that supports "benchmark hygiene" decisions, not a claim of improved prediction.</w:t>
+        <w:t>Here we do not build a new database or a new predictor. We audit the labels themselves: (i) how many drugs changed class between DILIrank 1.0 and 2.0, and in which direction; (ii) how compounds classified as ambiguous in DILIrank 1.0 carry binary labels across two disjoint source channels in a published benchmark — the Seal et al. (2024) gold standard [6] — and how the resulting label distribution depends on source provenance; (iii) how the same drugs are labeled in the full official DILIst dataset, as a same-drug comparison rather than a channel-level comparison; and (iv) what the reclassified compounds that survive into that benchmark's held-out set look like under the reproduced model. Prior work has examined how the choice of features, endpoints, and negative-sample definitions affects reported DILI model performance [7]; to our knowledge, neither the direction of version drift nor the source-dependent binary labeling of DILIrank's ambiguous class has been quantified. Our contribution is limited to checkable, quantitative facts about label provenance — the directionally asymmetric reclassification pattern of the 1.0→2.0 update, the specific path by which compounds classified as ambiguous in DILIrank 1.0 arrive in a published benchmark with binary labels, and the same-drug label correspondence between DILIrank 1.0 and the full DILIst dataset — reported as a descriptive, reproducible characterization that supports "benchmark hygiene" decisions, not a claim of improved prediction.</w:t>
       </w:r>
     </w:p>
     <w:p>
@@ -180,7 +180,7 @@
         <w:t>Construction dependence of the DILIst comparison.</w:t>
       </w:r>
       <w:r>
-        <w:t xml:space="preserve"> DILIst extends DILIrank with four literature-derived datasets and maps most/less to positive and no to negative [2]. For the 559 gold-standard rows that we match to a DILIrank-1.0 drug, agreement between DILIst's binary label and the non-ambiguous DILIrank class is therefore expected by construction. We report that agreement as a consistency check of the stated rule, not as independent corroboration; independence of DILIst labels is not claimed and is addressed further in Limitations. A further 431 DILIst-sourced rows (of 990) and 32 "CP Overlap"-sourced rows (of 121) fall outside DILIrank 1.0 and cannot enter the class-level audit at all.</w:t>
+        <w:t xml:space="preserve"> DILIst extends DILIrank with four literature-derived datasets and maps most/less to positive and no to negative [2]. For drugs matched between DILIst and DILIrank, agreement on non-ambiguous classes is therefore expected by construction. We report that agreement as a consistency check of the stated rule, not as independent corroboration; independence of DILIst labels is not claimed and is addressed further in Limitations.</w:t>
       </w:r>
     </w:p>
     <w:p>
@@ -209,6 +209,20 @@
       </w:r>
       <w:r>
         <w:t xml:space="preserve"> We used the shipped `DILI_Goldstandard_1111.csv` (1,111 compounds with `Source_rank`, `Source`, `TOXICITY`, `InChIKey`, `InChIKey14`) and the 888 / 223 split files. The gold standard's `Source_rank` field identifies two label channels: `Source_rank = 1` is the literature-augmented DILIst subset (990 rows), and `Source_rank = 13` is a pre-binarized, DILIrank-derived subset shipped as `Source = "DILIrank dataset CP Overlap REpsilber"` (121 rows, 97 positive / 24 negative); the upstream selection and binarization rule of this subset is not documented in the benchmark's public repository.</w:t>
+      </w:r>
+    </w:p>
+    <w:p>
+      <w:pPr>
+        <w:spacing w:line="360" w:lineRule="auto" w:after="120"/>
+      </w:pPr>
+      <w:r>
+        <w:rPr>
+          <w:b/>
+        </w:rPr>
+        <w:t>Full-DILIst same-drug comparison.</w:t>
+      </w:r>
+      <w:r>
+        <w:t xml:space="preserve"> The official FDA DILIst workbook (1,279 drugs; 768 positive / 511 negative) was downloaded from the FDA DILIst dataset page and matched to DILIrank 1.0 by structure. Names already covered by our PubChem pass were reused; the remaining 455 names were resolved via PubChem PUG REST (name → CID with salt-suffix-stripped fallbacks; 364 resolved, 91 without a PubChem record). Matching used the same full-InChIKey-priority rule as the benchmark analysis; because both sides resolve through PubChem canonical keys, the identity-conflict screen of the benchmark analysis does not arise here. Results are reported separately from the benchmark subset: the benchmark's DILIst-sourced rows are an upstream snapshot and are not the same object as the full official DILIst dataset.</w:t>
       </w:r>
     </w:p>
     <w:p>
@@ -574,7 +588,7 @@
         <w:t>Layer 3 — the ambiguous class, which the stated rules do not determine.</w:t>
       </w:r>
       <w:r>
-        <w:t xml:space="preserve"> In the Tier-B primary analysis, all disagreement in the matched set is confined to the ambiguous class, and it is directional in the shipped benchmark (under strict Tier-A matching, a single non-ambiguous discordance appears instead; Table 4). In the DILIst-sourced channel, every tallied ambiguous drug (80) is negative; in the DILIrank-derived "CP Overlap" channel (89 matched, 1 identity-conflict row excluded), every tallied ambiguous drug (30) is positive. Seal et al. describe their DILIrank-sourced labels as mapping most/less to positive and no to negative, with ambiguous excluded [6]; the shipped benchmark nonetheless carries binary labels for all 110 tallied compounds that DILIrank 1.0 classifies as ambiguous. Because the upstream rule of the "CP Overlap" subset is not documented in the repository, we characterize this distribution empirically and do not attribute the labels to any documented rule; and because the two channels are disjoint (Source_rank is mutually exclusive), this is a property of the benchmark's shipped label distribution rather than a same-drug comparison across two adjudications.</w:t>
+        <w:t xml:space="preserve"> In the Tier-B primary analysis, all disagreement in the matched set is confined to the ambiguous class, and it is directional in the shipped benchmark (under strict Tier-A matching, a single non-ambiguous discordance appears instead; Table 4). In the DILIst-sourced channel, every tallied ambiguous drug (80) is negative; in the DILIrank-derived "CP Overlap" channel (89 matched, 1 identity-conflict row excluded), every tallied ambiguous drug (30) is positive. Seal et al. describe their DILIrank-sourced labels as mapping most/less to positive and no to negative, with ambiguous excluded [6]; the shipped benchmark nonetheless carries binary labels for all 110 tallied compounds that DILIrank 1.0 classifies as ambiguous. Because the upstream rule of the "CP Overlap" subset is not documented in the repository, we characterize this distribution empirically and do not attribute the labels to any documented rule; and because the two channels are disjoint (Source_rank is mutually exclusive), this is a property of the benchmark's shipped label distribution rather than a same-drug comparison across two adjudications. §3.5 reports the same-drug comparison across the full official DILIst dataset.</w:t>
       </w:r>
     </w:p>
     <w:p>
@@ -1389,6 +1403,273 @@
     </w:p>
     <w:p>
       <w:pPr>
+        <w:pStyle w:val="Heading2"/>
+      </w:pPr>
+      <w:r>
+        <w:t>3.5 Same-drug comparison across the full official DILIst dataset</w:t>
+      </w:r>
+    </w:p>
+    <w:p>
+      <w:pPr>
+        <w:spacing w:line="360" w:lineRule="auto" w:after="120"/>
+      </w:pPr>
+      <w:r>
+        <w:t>Of the 1,279 drugs in the official FDA DILIst dataset, 836 match a DILIrank-1.0 drug at the structure level (Table 5); 443 do not — 352 have a PubChem record but no DILIrank-1.0 counterpart (the literature-augmented pool), and 91 have no PubChem record. The non-ambiguous classes agree with DILIst in 713/714 matched cases at Tier B (707/708 under strict full-InChIKey matching). The single exception is a racemate pair: norgestrel is DILIst-positive while its matched DILIrank-1.0 counterpart levonorgestrel is classified "no" — and DILIst itself labels norgestrel positive and levonorgestrel negative, so the discordance exists within DILIst as well as across sources. The ambiguous class — the part of the correspondence not determined by DILIst's stated construction rule — is labeled negative in 120 of 122 matched cases. The two positive exceptions are norethindrone (full-key match) and zopiclone (InChIKey14-only match to eszopiclone; DILIst itself labels zopiclone positive and eszopiclone negative, a second enantiomer pair). Under strict full-InChIKey matching, 121 ambiguous drugs remain (120 negative / 1 positive). This same-drug evidence is consistent with, and extends, the benchmark-level observation: the DILIst-side treatment of the ambiguous class is overwhelmingly negative (120/122), while the 30 positive ambiguous labels in the benchmark arrive exclusively through the "CP Overlap" channel.</w:t>
+      </w:r>
+    </w:p>
+    <w:p>
+      <w:pPr>
+        <w:spacing w:line="360" w:lineRule="auto" w:after="120"/>
+      </w:pPr>
+      <w:r>
+        <w:t>The benchmark's DILIst-sourced rows and the official DILIst dataset are not the same object. Two compounds that the benchmark's DILIst-sourced channel labels positive — armodafinil and tretinoin, whose skeleton keys YFGHCGITMMYXAQ and SHGAZHPCJJPHSC appear in the benchmark with `TOXICITY = 1` and `Source_rank = 1` — are absent from the official DILIst dataset (name-level and substring checks). These are precisely the two DILIst-positive rows excluded from Table 2's ambiguous tallies as identity conflicts. We report this benchmark-vs-official discrepancy as a checkable fact without attributing its cause, which could be an upstream snapshot difference, a pre-binarization rule, or a curation choice not documented in the benchmark's public repository.</w:t>
+      </w:r>
+    </w:p>
+    <w:p>
+      <w:pPr>
+        <w:spacing w:line="360" w:lineRule="auto" w:after="120"/>
+      </w:pPr>
+      <w:r>
+        <w:rPr>
+          <w:b/>
+        </w:rPr>
+        <w:t>Table 5. Same-drug label correspondence between the full official DILIst dataset and DILIrank 1.0 (Tier B; 836 matched of 1,279).</w:t>
+      </w:r>
+    </w:p>
+    <w:tbl>
+      <w:tblPr>
+        <w:tblStyle w:val="TableGrid"/>
+        <w:tblW w:type="auto" w:w="0"/>
+        <w:tblLook w:firstColumn="1" w:firstRow="1" w:lastColumn="0" w:lastRow="0" w:noHBand="0" w:noVBand="1" w:val="04A0"/>
+      </w:tblPr>
+      <w:tblGrid>
+        <w:gridCol w:w="2160"/>
+        <w:gridCol w:w="2160"/>
+        <w:gridCol w:w="2160"/>
+        <w:gridCol w:w="2160"/>
+      </w:tblGrid>
+      <w:tr>
+        <w:tc>
+          <w:tcPr>
+            <w:tcW w:type="dxa" w:w="2160"/>
+          </w:tcPr>
+          <w:p>
+            <w:r>
+              <w:rPr>
+                <w:b/>
+              </w:rPr>
+              <w:t>DILIrank-1.0 class</w:t>
+            </w:r>
+          </w:p>
+        </w:tc>
+        <w:tc>
+          <w:tcPr>
+            <w:tcW w:type="dxa" w:w="2160"/>
+          </w:tcPr>
+          <w:p>
+            <w:r>
+              <w:rPr>
+                <w:b/>
+              </w:rPr>
+              <w:t>DILIst negative (n)</w:t>
+            </w:r>
+          </w:p>
+        </w:tc>
+        <w:tc>
+          <w:tcPr>
+            <w:tcW w:type="dxa" w:w="2160"/>
+          </w:tcPr>
+          <w:p>
+            <w:r>
+              <w:rPr>
+                <w:b/>
+              </w:rPr>
+              <w:t>DILIst positive (n)</w:t>
+            </w:r>
+          </w:p>
+        </w:tc>
+        <w:tc>
+          <w:tcPr>
+            <w:tcW w:type="dxa" w:w="2160"/>
+          </w:tcPr>
+          <w:p>
+            <w:r>
+              <w:rPr>
+                <w:b/>
+              </w:rPr>
+              <w:t>Notes</w:t>
+            </w:r>
+          </w:p>
+        </w:tc>
+      </w:tr>
+      <w:tr>
+        <w:tc>
+          <w:tcPr>
+            <w:tcW w:type="dxa" w:w="2160"/>
+          </w:tcPr>
+          <w:p>
+            <w:r>
+              <w:t>most</w:t>
+            </w:r>
+          </w:p>
+        </w:tc>
+        <w:tc>
+          <w:tcPr>
+            <w:tcW w:type="dxa" w:w="2160"/>
+          </w:tcPr>
+          <w:p>
+            <w:r>
+              <w:t>0</w:t>
+            </w:r>
+          </w:p>
+        </w:tc>
+        <w:tc>
+          <w:tcPr>
+            <w:tcW w:type="dxa" w:w="2160"/>
+          </w:tcPr>
+          <w:p>
+            <w:r>
+              <w:t>183</w:t>
+            </w:r>
+          </w:p>
+        </w:tc>
+        <w:tc>
+          <w:tcPr>
+            <w:tcW w:type="dxa" w:w="2160"/>
+          </w:tcPr>
+          <w:p>
+            <w:r/>
+          </w:p>
+        </w:tc>
+      </w:tr>
+      <w:tr>
+        <w:tc>
+          <w:tcPr>
+            <w:tcW w:type="dxa" w:w="2160"/>
+          </w:tcPr>
+          <w:p>
+            <w:r>
+              <w:t>less</w:t>
+            </w:r>
+          </w:p>
+        </w:tc>
+        <w:tc>
+          <w:tcPr>
+            <w:tcW w:type="dxa" w:w="2160"/>
+          </w:tcPr>
+          <w:p>
+            <w:r>
+              <w:t>0</w:t>
+            </w:r>
+          </w:p>
+        </w:tc>
+        <w:tc>
+          <w:tcPr>
+            <w:tcW w:type="dxa" w:w="2160"/>
+          </w:tcPr>
+          <w:p>
+            <w:r>
+              <w:t>267</w:t>
+            </w:r>
+          </w:p>
+        </w:tc>
+        <w:tc>
+          <w:tcPr>
+            <w:tcW w:type="dxa" w:w="2160"/>
+          </w:tcPr>
+          <w:p>
+            <w:r/>
+          </w:p>
+        </w:tc>
+      </w:tr>
+      <w:tr>
+        <w:tc>
+          <w:tcPr>
+            <w:tcW w:type="dxa" w:w="2160"/>
+          </w:tcPr>
+          <w:p>
+            <w:r>
+              <w:t>no</w:t>
+            </w:r>
+          </w:p>
+        </w:tc>
+        <w:tc>
+          <w:tcPr>
+            <w:tcW w:type="dxa" w:w="2160"/>
+          </w:tcPr>
+          <w:p>
+            <w:r>
+              <w:t>263</w:t>
+            </w:r>
+          </w:p>
+        </w:tc>
+        <w:tc>
+          <w:tcPr>
+            <w:tcW w:type="dxa" w:w="2160"/>
+          </w:tcPr>
+          <w:p>
+            <w:r>
+              <w:t>1</w:t>
+            </w:r>
+          </w:p>
+        </w:tc>
+        <w:tc>
+          <w:tcPr>
+            <w:tcW w:type="dxa" w:w="2160"/>
+          </w:tcPr>
+          <w:p>
+            <w:r>
+              <w:t>exception: norgestrel (racemate of levonorgestrel; DILIst-internal labels: norgestrel 1, levonorgestrel 0)</w:t>
+            </w:r>
+          </w:p>
+        </w:tc>
+      </w:tr>
+      <w:tr>
+        <w:tc>
+          <w:tcPr>
+            <w:tcW w:type="dxa" w:w="2160"/>
+          </w:tcPr>
+          <w:p>
+            <w:r>
+              <w:t>ambiguous</w:t>
+            </w:r>
+          </w:p>
+        </w:tc>
+        <w:tc>
+          <w:tcPr>
+            <w:tcW w:type="dxa" w:w="2160"/>
+          </w:tcPr>
+          <w:p>
+            <w:r>
+              <w:t>120</w:t>
+            </w:r>
+          </w:p>
+        </w:tc>
+        <w:tc>
+          <w:tcPr>
+            <w:tcW w:type="dxa" w:w="2160"/>
+          </w:tcPr>
+          <w:p>
+            <w:r>
+              <w:t>2</w:t>
+            </w:r>
+          </w:p>
+        </w:tc>
+        <w:tc>
+          <w:tcPr>
+            <w:tcW w:type="dxa" w:w="2160"/>
+          </w:tcPr>
+          <w:p>
+            <w:r>
+              <w:t>exceptions: norethindrone (full key); zopiclone (InChIKey14-only; DILIst-internal labels: zopiclone 1, eszopiclone 0)</w:t>
+            </w:r>
+          </w:p>
+        </w:tc>
+      </w:tr>
+    </w:tbl>
+    <w:p/>
+    <w:p>
+      <w:pPr>
         <w:pStyle w:val="Heading1"/>
       </w:pPr>
       <w:r>
@@ -1409,7 +1690,7 @@
         <w:t>directionally asymmetric reclassification pattern</w:t>
       </w:r>
       <w:r>
-        <w:t xml:space="preserve">, rather than a strictly monotone change across all four labels. Eighteen drugs moved from no to less DILI concern, whereas 31 moved from the ambiguous category to a defined concern category. Because FDA defines Ambiguous-DILI-concern as a category of undetermined causality, these 31 transitions are interpreted as resolution of classification uncertainty, not as ordinal severity upgrades. No drugs moved from a defined concern category to a lower defined concern category. For models that binarize or exclude ambiguous labels, the effect of these revisions on the effective prediction target depends on how the ambiguous category is handled. Second, in the Tier-B primary analysis, cross-source disagreement is </w:t>
+        <w:t xml:space="preserve">, rather than a strictly monotone change across all four labels. Eighteen drugs moved from no to less DILI concern, whereas 31 moved from the ambiguous category to a defined concern category. Because FDA defines Ambiguous-DILI-concern as a category of undetermined causality, these 31 transitions are interpreted as resolution of classification uncertainty, not as ordinal severity upgrades. No drugs moved from a defined concern category to a lower defined concern category. For models that binarize or exclude ambiguous labels, the effect of these revisions on the effective prediction target depends on how the ambiguous category is handled. Second, in the Tier-B primary analysis, cross-source disagreement in the benchmark is </w:t>
       </w:r>
       <w:r>
         <w:rPr>
@@ -1418,7 +1699,7 @@
         <w:t>not uniform</w:t>
       </w:r>
       <w:r>
-        <w:t xml:space="preserve"> — it is confined to the ambiguous class, and it is directional in the shipped benchmark (DILIst-sourced channel → negative, "CP Overlap" channel → positive); strict Tier-A matching surfaces a single non-ambiguous discordance instead (Table 4). The 476/476 non-ambiguous agreement must be read with its construction caveat: DILIst was built on top of DILIrank with an explicit most/less→positive, no→negative rule [2], so that agreement is a consistency check of the rule. What the stated rules do not determine is the ambiguous class: Seal et al. describe their DILIrank-sourced labels as mapping most/less to positive and no to negative, with ambiguous excluded [6], yet the shipped benchmark carries binary labels for all 110 tallied compounds that DILIrank 1.0 classifies as ambiguous. We characterize this distribution empirically and do not interpret it as a violation of any documented rule, because the upstream binarization of the "CP Overlap" subset is undocumented; nor do we make any claim about how two independent adjudications would label the same drug, because the two channels are disjoint. Third, the common shortcut of silently dropping or binary-flattening the ambiguous class does not remove the problem; it relocates it, in a source-dependent direction, into the training labels of the benchmark. The direction of that treatment is a property of the channel, not of the drug.</w:t>
+        <w:t xml:space="preserve"> — it is confined to the ambiguous class, and it is directional in the shipped benchmark (DILIst-sourced channel → negative, "CP Overlap" channel → positive); strict Tier-A matching surfaces a single non-ambiguous discordance instead (Table 4). The 476/476 non-ambiguous agreement must be read with its construction caveat: DILIst was built on top of DILIrank with an explicit most/less→positive, no→negative rule [2], so that agreement is a consistency check of the rule. The same-drug comparison across the full official DILIst dataset (§3.5) shows that the construction-consistent core holds at full scale (713/714), that the ambiguous class is labeled negative in 120 of 122 same-drug matched cases with two named exceptions, and that the benchmark's DILIst-sourced rows are an upstream snapshot that is not identical to the official dataset — two benchmark rows (armodafinil, tretinoin) have no counterpart in the official DILIst release. We characterize these distributions empirically and do not interpret them as violations of any documented rule, because the upstream binarization of the "CP Overlap" subset is undocumented; nor do we claim to adjudicate which source is correct. Third, the common shortcut of silently dropping or binary-flattening the ambiguous class does not remove the problem; it relocates it, in a source-dependent direction, into the training labels of the benchmark. The direction of that treatment is a property of the channel, not of the drug.</w:t>
       </w:r>
     </w:p>
     <w:p>
@@ -1426,7 +1707,7 @@
         <w:spacing w:line="360" w:lineRule="auto" w:after="120"/>
       </w:pPr>
       <w:r>
-        <w:t>Our findings are complementary to, and deliberately narrower than, i-DILI [4], which harmonizes seven sources into one binary label with a confidence score but drops the ambiguous class and uses only DILIrank 2.0; and StateFlux [5], which used the 300 added drugs as a temporal test for feature representations. We do not claim those works are incomplete; we claim two distinct, checkable facts that neither reports: the directionally asymmetric reclassification pattern of the 1.0→2.0 update, and the specific path by which compounds classified as ambiguous in DILIrank 1.0 arrive in a published benchmark with binary labels. Both remain descriptive statements about data provenance; they do not require, and we do not offer, a claim that any benchmark's labels are wrong or that any model's performance is misreported.</w:t>
+        <w:t>Our findings are complementary to, and deliberately narrower than, i-DILI [4], which harmonizes seven sources into one binary label with a confidence score but drops the ambiguous class and uses only DILIrank 2.0; and StateFlux [5], which used the 300 added drugs as a temporal test for feature representations. We do not claim those works are incomplete; we claim checkable, quantitative facts about label provenance that neither reports: the directionally asymmetric reclassification pattern of the 1.0→2.0 update, the specific path by which compounds classified as ambiguous in DILIrank 1.0 arrive in a published benchmark with binary labels, and the same-drug label correspondence between DILIrank 1.0 and the full official DILIst dataset. All remain descriptive statements about data provenance; they do not require, and we do not offer, a claim that any benchmark's labels are wrong or that any model's performance is misreported.</w:t>
       </w:r>
     </w:p>
     <w:p>
@@ -1440,7 +1721,7 @@
         <w:t>Limitations.</w:t>
       </w:r>
       <w:r>
-        <w:t xml:space="preserve"> (i) Structure bridging is InChIKey-based; the mapping pass stored no SMILES, so a SMILES-level cross-check was unavailable, and 13 of 28 in-Seal matches are InChIKey14-only (Seal stores `-UHFFFAOYSA-`), so their stereo identity is unverified; the Tier-A column of Table 4 bounds the effect of this choice. (ii) One in-Seal reclassified drug (tretinoin) shares a skeleton InChIKey with another DILIrank drug and cannot be uniquely attributed. (iii) Only 559 of the 990 DILIst-sourced rows and 89 of the 121 "CP Overlap"-sourced rows could be matched to a DILIrank-1.0 class, so the agreement matrix covers the matched subset; the 431 and 32 outside rows are outside the audit by construction. (iv) The held-out reclassified sample is n = 5 (n = 2 under strict matching), so the model-behaviour portion is exploratory only and is reported in the Supplementary Information; the 23 training-set reclassified drugs lack out-of-fold predictions and were not used. (v) We did not verify that DILIrank-1.0 labels themselves are "correct" against primary literature; we characterize </w:t>
+        <w:t xml:space="preserve"> (i) Structure bridging is InChIKey-based; the mapping pass stored no SMILES, so a SMILES-level cross-check was unavailable, and 13 of 28 in-Seal matches are InChIKey14-only (Seal stores `-UHFFFAOYSA-`), so their stereo identity is unverified; the Tier-A column of Table 4 bounds the effect of this choice. (ii) One in-Seal reclassified drug (tretinoin) shares a skeleton InChIKey with another DILIrank drug and cannot be uniquely attributed. (iii) Only 559 of the 990 DILIst-sourced rows and 89 of the 121 "CP Overlap"-sourced rows could be matched to a DILIrank-1.0 class, so the benchmark agreement matrix covers the matched subset; the 431 and 32 outside rows are outside the audit by construction. In the full-DILIst comparison, 443 of 1,279 DILIst drugs fall outside DILIrank 1.0 (352 with structure, 91 without a PubChem record) and carry no comparable class. (iv) The held-out reclassified sample is n = 5 (n = 2 under strict matching), so the model-behaviour portion is exploratory only and is reported in the Supplementary Information; the 23 training-set reclassified drugs lack out-of-fold predictions and were not used. (v) We did not verify that DILIrank-1.0 labels themselves are "correct" against primary literature; we characterize </w:t>
       </w:r>
       <w:r>
         <w:rPr>
@@ -1449,7 +1730,7 @@
         <w:t>agreement between sources and versions</w:t>
       </w:r>
       <w:r>
-        <w:t xml:space="preserve">, not ground truth. (vi) The upstream selection and binarization rule of the "CP Overlap" subset is not documented in the benchmark's public repository; its label policy is characterized here empirically (30/30 matched ambiguous compounds positive) rather than from a stated rule. (vii) We did not re-trace the per-drug literature provenance of DILIst labels; the non-ambiguous agreement (Layer 1) is therefore reported as construction-consistent, and </w:t>
+        <w:t xml:space="preserve">, not ground truth. (vi) The upstream selection and binarization rule of the "CP Overlap" subset is not documented in the benchmark's public repository; its label policy is characterized here empirically (30/30 matched ambiguous compounds positive) rather than from a stated rule. (vii) The non-ambiguous same-drug agreement is reported as construction-consistent because DILIst was built on top of DILIrank; </w:t>
       </w:r>
       <w:r>
         <w:rPr>
@@ -1458,7 +1739,7 @@
         <w:t>independence of the two sources is not demonstrated</w:t>
       </w:r>
       <w:r>
-        <w:t xml:space="preserve"> anywhere in this audit.</w:t>
+        <w:t xml:space="preserve"> anywhere in this audit, and the cause of the benchmark-vs-official discrepancies (armodafinil, tretinoin) is not attributed. (viii) Two of the same-drug exceptions (norgestrel/levonorgestrel; zopiclone/eszopiclone) involve racemate/enantiomer pairs whose identity resolution depends on the PubChem records used; the DILIst-internal label opposition within each pair is verifiable directly from the official workbook.</w:t>
       </w:r>
     </w:p>
     <w:p>
@@ -1472,7 +1753,7 @@
         <w:t>Benchmark-hygiene recommendation.</w:t>
       </w:r>
       <w:r>
-        <w:t xml:space="preserve"> When compiling or reusing a DILI benchmark: keep the ambiguous class as a third state (or an explicit exclusion flag with a recorded direction), report per-drug label provenance, re-check version alignment before reporting model performance, and audit the shipped labels against the benchmark's stated label policy, recording any undocumented upstream binarization steps (here: the "CP Overlap" subset, whose rule is not documented in the repository). These are inexpensive steps that prevent label instability from being mistaken for model error.</w:t>
+        <w:t xml:space="preserve"> When compiling or reusing a DILI benchmark: keep the ambiguous class as a third state (or an explicit exclusion flag with a recorded direction), report per-drug label provenance, re-check version alignment before reporting model performance, and audit the shipped labels against the benchmark's stated label policy, recording any undocumented upstream binarization steps (here: the "CP Overlap" subset, whose rule is not documented in the repository) and any divergence between the shipped snapshot and the official source dataset it names (here: armodafinil and tretinoin). These are inexpensive steps that prevent label instability from being mistaken for model error.</w:t>
       </w:r>
     </w:p>
     <w:p>
@@ -1488,7 +1769,7 @@
         <w:spacing w:line="360" w:lineRule="auto" w:after="120"/>
       </w:pPr>
       <w:r>
-        <w:t>The full per-drug match table (Tier B; all matched drugs with class, channel, toxicity, match tier, and conflict flag), the 49-row reclassification table, the sensitivity summary, and an input manifest (paths, sizes, sha256) are generated by `repro/generate_analysis.py` (Python 3.10, pandas) from the raw inputs listed in the manifest, and are provided in `repro_outputs/`. The previously produced per-drug alignment table for the 49 reclassified drugs remains at `d2_pilot/D2_label_stability_alignment.csv`. A versioned public repository is available at https://github.com/mengyufanqiu-maker/-dili-label-provenance-audit. DILIrank versions are the official FDA workbooks; the Seal et al. gold standard and split files are from the authors' public repository [6]; the held-out probability vector and the 0.6386 Youden threshold come from our earlier reproduction of the Seal et al. pipeline, verified against the authors' published predictions. Table S1 is in the Supplementary Information.</w:t>
+        <w:t>The full per-drug match table (Tier B; all matched drugs with class, channel, toxicity, match tier, and conflict flag), the 49-row reclassification table, the sensitivity summary, the full-DILIst per-drug match table and agreement matrices, the PubChem lookup records for the 455 additional DILIst names (including salt-stripped variants and no-hit names), and an input manifest (paths, sizes, sha256, sources) are generated by `repro/generate_analysis.py` and `repro/full_dilist_comparison.py` (Python 3.10, pandas) from the raw inputs listed in the manifest, and are provided in `repro_outputs/`. The previously produced per-drug alignment table for the 49 reclassified drugs remains at `d2_pilot/D2_label_stability_alignment.csv`. A versioned public repository is available at https://github.com/mengyufanqiu-maker/-dili-label-provenance-audit. DILIrank versions and the DILIst dataset are the official FDA workbooks (FDA DILIrank 2.0 and DILIst dataset pages); the Seal et al. gold standard and split files are from the authors' public repository [6]; the held-out probability vector and the 0.6386 Youden threshold come from our earlier reproduction of the Seal et al. pipeline, verified against the authors' published predictions. Table S1 is in the Supplementary Information.</w:t>
       </w:r>
     </w:p>
     <w:p>
@@ -1660,7 +1941,7 @@
         <w:rPr>
           <w:i/>
         </w:rPr>
-        <w:t>Remaining before submission: confirm author lists for refs 1–3, 6, and 9 against PubMed and format per the target journal's style; renumber citations per the target journal's style; replace markdown tables with journal table format. Figures 1–2 (reclassification directions; cross-source filtering) are provided as `figures/fig1_reclassification_directions.png` and `figures/fig2_cross_source_filtering.png`.</w:t>
+        <w:t>Remaining before submission: confirm author lists for refs 1–3, 6, and 9 against PubMed and format per the target journal's style; renumber citations per the target journal's style; replace markdown tables with journal table format. Figures 1–2 (reclassification directions; cross-source filtering) are provided as `figures/fig1_reclassification_directions.png` and `figures/fig2_cross_source_filtering.png`; a figure for Table 5 can be added at formatting stage.</w:t>
       </w:r>
     </w:p>
     <w:sectPr>

</xml_diff>

<commit_message>
v0.7: tier-specific named exceptions, norgestrel reframed as entity-normalization case, source-provenance discrepancy wording
</commit_message>
<xml_diff>
--- a/submission_docx/manuscript.docx
+++ b/submission_docx/manuscript.docx
@@ -21,7 +21,7 @@
         <w:rPr>
           <w:i/>
         </w:rPr>
-        <w:t>Draft v0.6 — research note / data note. Not yet submission-ready. All numeric claims below are reproduced from local data by the scripts in `repro/` (see Data availability). No new model was trained and no label was modified. Revision v0.5→v0.6: added a same-drug cross-source comparison across the full official FDA DILIst dataset (new §3.5, Table 5; 836/1,279 drugs matched to DILIrank 1.0); the benchmark's DILIst-sourced subset and the full official DILIst dataset are now reported as distinct objects; two compounds (armodafinil, tretinoin) are shown to be absent from the official DILIst dataset despite appearing as positive DILIst-sourced rows in the benchmark; the "no same-drug comparison" limitation is correspondingly revised.</w:t>
+        <w:t>Draft v0.7 — research note / data note. Not yet submission-ready. All numeric claims below are reproduced from local data by the scripts in `repro/` (see Data availability). No new model was trained and no label was modified. Revision v0.6→v0.7: the full-DILIst exceptions are now reported per matching tier with named drugs (Tier A: norgestrel among defined classes, norethindrone among ambiguous; Tier B adds zopiclone); the norgestrel case is reframed as a DILIst-internal racemate/enantiomer label split (an entity-normalization case study) rather than a same-structure cross-source conflict — DILIrank and DILIst agree on levonorgestrel itself; the armodafinil/tretinoin finding is renamed a benchmark source-provenance discrepancy, with the benchmark rows' stereo-less InChIKeys documented and no cause attributed.</w:t>
       </w:r>
     </w:p>
     <w:p>
@@ -71,7 +71,7 @@
         <w:t>Results.</w:t>
       </w:r>
       <w:r>
-        <w:t xml:space="preserve"> Between versions, 0 drugs were removed and 300 were added; 49 were reclassified. All 49 reclassifications ended in a defined concern category; among transitions between defined concern categories, 18 were escalations (no → less) and none were downgrades. The remaining 31 transitions resolved the ambiguous category to a defined concern category (27 to less, 4 to most). In the benchmark, among 559 DILIst-sourced compounds with a DILIrank-1.0 class, the non-ambiguous classes agree with DILIst (476/476) — an agreement that is partly definitional, because DILIst was constructed on top of DILIrank with a stated most/less→positive, no→negative rule [2], and we therefore treat it as a consistency check of that rule rather than independent corroboration. The informative pattern is the ambiguous class: in the matched ambiguous subset of the benchmark, 80 DILIrank-1.0-ambiguous drugs carry a negative label in the DILIst-sourced channel and 30 a positive label in the pre-binarized, DILIrank-derived "CP Overlap" channel; the same directional split holds under strict full-InChIKey matching (44 negative / 17 positive). In the full official DILIst dataset, 836 drugs match DILIrank 1.0 at the structure level: the non-ambiguous classes agree in 713/714 cases (the single exception is the norgestrel/levonorgestrel racemate pair), and 122 matched ambiguous drugs carry 120 negative and 2 positive DILIst labels (norethindrone; zopiclone). Two compounds (armodafinil, tretinoin) appear as positive DILIst-sourced rows in the benchmark but are absent from the official DILIst dataset. Of the 49 reclassified drugs, 28 fall inside the Seal gold standard (23 train / 5 held-out); the 5 held-out drugs all carry a "less" label in version 2.0, and their reproduced DILIPredictor probabilities straddle the published Youden threshold (0.6386): 2 predicted positive, 3 negative, and all five lie within 0.22 of equiprobability.</w:t>
+        <w:t xml:space="preserve"> Between versions, 0 drugs were removed and 300 were added; 49 were reclassified. All 49 reclassifications ended in a defined concern category; among transitions between defined concern categories, 18 were escalations (no → less) and none were downgrades. The remaining 31 transitions resolved the ambiguous category to a defined concern category (27 to less, 4 to most). In the benchmark, among 559 DILIst-sourced compounds with a DILIrank-1.0 class, the non-ambiguous classes agree with DILIst (476/476) — an agreement that is partly definitional, because DILIst was constructed on top of DILIrank with a stated most/less→positive, no→negative rule [2], and we therefore treat it as a consistency check of that rule rather than independent corroboration. The informative pattern is the ambiguous class: in the matched ambiguous subset of the benchmark, 80 DILIrank-1.0-ambiguous drugs carry a negative label in the DILIst-sourced channel and 30 a positive label in the pre-binarized, DILIrank-derived "CP Overlap" channel; the same directional split holds under strict full-InChIKey matching (44 negative / 17 positive). In the full official DILIst dataset, 836 drugs match DILIrank 1.0 at the structure level: the non-ambiguous classes agree in 707/708 cases under strict full-InChIKey matching and 713/714 in the main analysis; the single non-agreeing case in both tiers is the norgestrel row, which reflects a DILIst-internal label split between a racemate and its enantiomer (norgestrel positive vs levonorgestrel negative — DILIrank and DILIst agree on levonorgestrel itself) rather than a same-structure cross-source conflict. The 122 matched ambiguous drugs carry 120 negative and 2 positive DILIst labels (norethindrone; zopiclone — 121 and 1 positive under strict matching). Two compounds (armodafinil, tretinoin) appear as positive DILIst-sourced rows in the benchmark but are absent from the official DILIst dataset, a source-provenance discrepancy whose cause is not attributed. Of the 49 reclassified drugs, 28 fall inside the Seal gold standard (23 train / 5 held-out); the 5 held-out drugs all carry a "less" label in version 2.0, and their reproduced DILIPredictor probabilities straddle the published Youden threshold (0.6386): 2 predicted positive, 3 negative, and all five lie within 0.22 of equiprobability.</w:t>
       </w:r>
     </w:p>
     <w:p>
@@ -85,7 +85,7 @@
         <w:t>Conclusions.</w:t>
       </w:r>
       <w:r>
-        <w:t xml:space="preserve"> DILI reference-label instability is concentrated in the epistemically uncertain class and is directional in three senses: all 49 reclassifications ended in a defined concern category (18 escalations and no downgrades among defined-class transitions); in a widely used shipped benchmark the ambiguous class carries binary labels that differ in direction between two disjoint source channels; and in the full official DILIst dataset the ambiguous class is labeled negative for 120 of 122 same-drug matched cases, with two named exceptions. The benchmark's DILIst-sourced rows and the official DILIst dataset are not the same object, and two benchmark rows have no counterpart in the official dataset. These are descriptive properties of the shipped data, not claims about label correctness. Benchmarks should treat the ambiguous class explicitly and report per-drug label provenance instead of silently merging or discarding it. The small number of reclassified held-out compounds (n = 5; n = 2 under strict matching) limits this work to a descriptive audit; larger out-of-fold samples would be needed for inferential claims about model behaviour.</w:t>
+        <w:t xml:space="preserve"> DILI reference-label instability is concentrated in the epistemically uncertain class and is directional in three senses: all 49 reclassifications ended in a defined concern category (18 escalations and no downgrades among defined-class transitions); in a widely used shipped benchmark the ambiguous class carries binary labels that differ in direction between two disjoint source channels; and in the full official DILIst dataset the ambiguous class is labeled negative for 120 of 122 same-drug matched cases, with two named exceptions (one under strict matching). The benchmark's DILIst-sourced rows and the official DILIst dataset are not the same object, and two benchmark rows have no counterpart in the official dataset (a source-provenance discrepancy). These are descriptive properties of the shipped data, not claims about label correctness. Benchmarks should treat the ambiguous class explicitly and report per-drug label provenance instead of silently merging or discarding it. The small number of reclassified held-out compounds (n = 5; n = 2 under strict matching) limits this work to a descriptive audit; larger out-of-fold samples would be needed for inferential claims about model behaviour.</w:t>
       </w:r>
     </w:p>
     <w:p>
@@ -1414,7 +1414,7 @@
         <w:spacing w:line="360" w:lineRule="auto" w:after="120"/>
       </w:pPr>
       <w:r>
-        <w:t>Of the 1,279 drugs in the official FDA DILIst dataset, 836 match a DILIrank-1.0 drug at the structure level (Table 5); 443 do not — 352 have a PubChem record but no DILIrank-1.0 counterpart (the literature-augmented pool), and 91 have no PubChem record. The non-ambiguous classes agree with DILIst in 713/714 matched cases at Tier B (707/708 under strict full-InChIKey matching). The single exception is a racemate pair: norgestrel is DILIst-positive while its matched DILIrank-1.0 counterpart levonorgestrel is classified "no" — and DILIst itself labels norgestrel positive and levonorgestrel negative, so the discordance exists within DILIst as well as across sources. The ambiguous class — the part of the correspondence not determined by DILIst's stated construction rule — is labeled negative in 120 of 122 matched cases. The two positive exceptions are norethindrone (full-key match) and zopiclone (InChIKey14-only match to eszopiclone; DILIst itself labels zopiclone positive and eszopiclone negative, a second enantiomer pair). Under strict full-InChIKey matching, 121 ambiguous drugs remain (120 negative / 1 positive). This same-drug evidence is consistent with, and extends, the benchmark-level observation: the DILIst-side treatment of the ambiguous class is overwhelmingly negative (120/122), while the 30 positive ambiguous labels in the benchmark arrive exclusively through the "CP Overlap" channel.</w:t>
+        <w:t>Of the 1,279 drugs in the official FDA DILIst dataset, 836 match a DILIrank-1.0 drug at the structure level (Table 5); 443 do not — 352 have a PubChem record but no DILIrank-1.0 counterpart (the literature-augmented pool), and 91 have no PubChem record. The non-ambiguous classes agree with DILIst in 707/708 matched cases under strict full-InChIKey matching (Tier A) and in 713/714 in the main analysis (Tier B); the difference between the tiers is carried entirely by the seven InChIKey14-only rows, six of which are class-consistent. The single non-agreeing case is identical in both tiers and is an entity-normalization case rather than a same-structure cross-source conflict: PubChem resolves the DILIst name "norgestrel" to the levonorgestrel compound record, so the row is a full-key match to levonorgestrel (DILIrank class "no"); DILIst labels its norgestrel entry positive and its levonorgestrel entry negative — a DILIst-internal split between a racemate and its enantiomer — while DILIst and DILIrank agree on levonorgestrel itself (negative vs "no"). No other non-ambiguous non-agreement exists at either tier.</w:t>
       </w:r>
     </w:p>
     <w:p>
@@ -1422,7 +1422,15 @@
         <w:spacing w:line="360" w:lineRule="auto" w:after="120"/>
       </w:pPr>
       <w:r>
-        <w:t>The benchmark's DILIst-sourced rows and the official DILIst dataset are not the same object. Two compounds that the benchmark's DILIst-sourced channel labels positive — armodafinil and tretinoin, whose skeleton keys YFGHCGITMMYXAQ and SHGAZHPCJJPHSC appear in the benchmark with `TOXICITY = 1` and `Source_rank = 1` — are absent from the official DILIst dataset (name-level and substring checks). These are precisely the two DILIst-positive rows excluded from Table 2's ambiguous tallies as identity conflicts. We report this benchmark-vs-official discrepancy as a checkable fact without attributing its cause, which could be an upstream snapshot difference, a pre-binarization rule, or a curation choice not documented in the benchmark's public repository.</w:t>
+        <w:t>The ambiguous class — the part of the correspondence not determined by DILIst's stated construction rule — is labeled negative in 120 of 122 matched cases in the main analysis, and in 120 of 121 under strict matching. The positive exceptions are tier-specific: norethindrone (full-key match; the synonym norethisterone, a genuine same-drug ambiguous-positive) at both tiers, and zopiclone (InChIKey14-only match to eszopiclone; DILIst itself labels zopiclone positive and eszopiclone negative, a second racemate/enantiomer pair) at Tier B only. This same-drug evidence is consistent with, and extends, the benchmark-level observation: the DILIst-side treatment of the ambiguous class is overwhelmingly negative (120/122), while the 30 positive ambiguous labels in the benchmark arrive exclusively through the "CP Overlap" channel.</w:t>
+      </w:r>
+    </w:p>
+    <w:p>
+      <w:pPr>
+        <w:spacing w:line="360" w:lineRule="auto" w:after="120"/>
+      </w:pPr>
+      <w:r>
+        <w:t>The benchmark's DILIst-sourced rows and the official DILIst dataset are not the same object. Two compounds that the benchmark's DILIst-sourced channel labels positive — armodafinil and tretinoin, whose skeleton keys YFGHCGITMMYXAQ and SHGAZHPCJJPHSC appear in the benchmark with `TOXICITY = 1`, `Source_rank = 1`, Source "DILIst Classification Oral", and stereo-less full InChIKeys (`-UHFFFAOYSA-N`) — are absent from the official DILIst dataset (name-level and substring checks). These are precisely the two DILIst-positive rows excluded from Table 2's ambiguous tallies as identity conflicts. We report this benchmark source-provenance discrepancy as a checkable fact without attributing its cause, which could be an upstream snapshot difference, a pre-binarization rule, an identity-normalization artifact, or a curation choice not documented in the benchmark's public repository.</w:t>
       </w:r>
     </w:p>
     <w:p>
@@ -1619,7 +1627,7 @@
           </w:tcPr>
           <w:p>
             <w:r>
-              <w:t>exception: norgestrel (racemate of levonorgestrel; DILIst-internal labels: norgestrel 1, levonorgestrel 0)</w:t>
+              <w:t>norgestrel row: entity-normalization case — PubChem resolves "norgestrel" to levonorgestrel (full-key match); DILIst-internal labels: norgestrel 1 vs levonorgestrel 0; DILIst and DILIrank agree on levonorgestrel (0 vs "no")</w:t>
             </w:r>
           </w:p>
         </w:tc>
@@ -1661,7 +1669,7 @@
           </w:tcPr>
           <w:p>
             <w:r>
-              <w:t>exceptions: norethindrone (full key); zopiclone (InChIKey14-only; DILIst-internal labels: zopiclone 1, eszopiclone 0)</w:t>
+              <w:t>norethindrone (full key; synonym norethisterone) at both tiers; zopiclone (InChIKey14-only; DILIst-internal zopiclone 1 vs eszopiclone 0) at Tier B only</w:t>
             </w:r>
           </w:p>
         </w:tc>
@@ -1699,7 +1707,7 @@
         <w:t>not uniform</w:t>
       </w:r>
       <w:r>
-        <w:t xml:space="preserve"> — it is confined to the ambiguous class, and it is directional in the shipped benchmark (DILIst-sourced channel → negative, "CP Overlap" channel → positive); strict Tier-A matching surfaces a single non-ambiguous discordance instead (Table 4). The 476/476 non-ambiguous agreement must be read with its construction caveat: DILIst was built on top of DILIrank with an explicit most/less→positive, no→negative rule [2], so that agreement is a consistency check of the rule. The same-drug comparison across the full official DILIst dataset (§3.5) shows that the construction-consistent core holds at full scale (713/714), that the ambiguous class is labeled negative in 120 of 122 same-drug matched cases with two named exceptions, and that the benchmark's DILIst-sourced rows are an upstream snapshot that is not identical to the official dataset — two benchmark rows (armodafinil, tretinoin) have no counterpart in the official DILIst release. We characterize these distributions empirically and do not interpret them as violations of any documented rule, because the upstream binarization of the "CP Overlap" subset is undocumented; nor do we claim to adjudicate which source is correct. Third, the common shortcut of silently dropping or binary-flattening the ambiguous class does not remove the problem; it relocates it, in a source-dependent direction, into the training labels of the benchmark. The direction of that treatment is a property of the channel, not of the drug.</w:t>
+        <w:t xml:space="preserve"> — it is confined to the ambiguous class, and it is directional in the shipped benchmark (DILIst-sourced channel → negative, "CP Overlap" channel → positive); strict Tier-A matching surfaces a single non-ambiguous discordance instead (Table 4). The 476/476 non-ambiguous agreement must be read with its construction caveat: DILIst was built on top of DILIrank with an explicit most/less→positive, no→negative rule [2], so that agreement is a consistency check of the rule. The same-drug comparison across the full official DILIst dataset (§3.5) shows that the construction-consistent core holds at full scale (707/708 strict; 713/714 main), that the single non-ambiguous non-agreeing case is a DILIst-internal racemate/enantiomer label split rather than a same-structure cross-source conflict, that the ambiguous class is labeled negative in 120 of 122 same-drug matched cases with two named, tier-specific exceptions, and that the benchmark's DILIst-sourced rows are not identical to the official dataset — two benchmark rows (armodafinil, tretinoin) have no counterpart in the official DILIst release, a source-provenance discrepancy. We characterize these distributions empirically and do not interpret them as violations of any documented rule, because the upstream binarization of the "CP Overlap" subset is undocumented; nor do we claim to adjudicate which source is correct. Third, the common shortcut of silently dropping or binary-flattening the ambiguous class does not remove the problem; it relocates it, in a source-dependent direction, into the training labels of the benchmark. The direction of that treatment is a property of the channel, not of the drug.</w:t>
       </w:r>
     </w:p>
     <w:p>
@@ -1739,7 +1747,7 @@
         <w:t>independence of the two sources is not demonstrated</w:t>
       </w:r>
       <w:r>
-        <w:t xml:space="preserve"> anywhere in this audit, and the cause of the benchmark-vs-official discrepancies (armodafinil, tretinoin) is not attributed. (viii) Two of the same-drug exceptions (norgestrel/levonorgestrel; zopiclone/eszopiclone) involve racemate/enantiomer pairs whose identity resolution depends on the PubChem records used; the DILIst-internal label opposition within each pair is verifiable directly from the official workbook.</w:t>
+        <w:t xml:space="preserve"> anywhere in this audit, and the cause of the benchmark-vs-official discrepancies (armodafinil, tretinoin) is not attributed. (viii) The non-ambiguous non-agreeing case (norgestrel/levonorgestrel) and one ambiguous-positive case (zopiclone/eszopiclone) involve racemate/enantiomer pairs whose identity resolution depends on the PubChem records used; the DILIst-internal label opposition within each pair is verifiable directly from the official workbook, and neither is presented as a same-structure cross-source conflict.</w:t>
       </w:r>
     </w:p>
     <w:p>

</xml_diff>

<commit_message>
v0.8: OOF predictions for 23 training-set reclassified drugs (Table S2), SI and repro updated
</commit_message>
<xml_diff>
--- a/submission_docx/manuscript.docx
+++ b/submission_docx/manuscript.docx
@@ -21,7 +21,7 @@
         <w:rPr>
           <w:i/>
         </w:rPr>
-        <w:t>Draft v0.7 — research note / data note. Not yet submission-ready. All numeric claims below are reproduced from local data by the scripts in `repro/` (see Data availability). No new model was trained and no label was modified. Revision v0.6→v0.7: the full-DILIst exceptions are now reported per matching tier with named drugs (Tier A: norgestrel among defined classes, norethindrone among ambiguous; Tier B adds zopiclone); the norgestrel case is reframed as a DILIst-internal racemate/enantiomer label split (an entity-normalization case study) rather than a same-structure cross-source conflict — DILIrank and DILIst agree on levonorgestrel itself; the armodafinil/tretinoin finding is renamed a benchmark source-provenance discrepancy, with the benchmark rows' stereo-less InChIKeys documented and no cause attributed.</w:t>
+        <w:t>Draft v0.8 — research note / data note. Revision v0.7→v0.8: added out-of-fold predictions for the 23 training-set reclassified drugs (Table S2, Supplementary Information), computed with the published pipeline's own cross-validation convention (the 4-fold cross_val_predict of the selected final model that the authors themselves use for threshold selection; model selection used all 888 training labels as in the original pipeline, and this is disclosed rather than presented as leakage-free), reported separately from the held-out predictions and used descriptively only. Not yet submission-ready. All numeric claims below are reproduced from local data by the scripts in `repro/` (see Data availability). No new model was trained and no label was modified. Revision v0.6→v0.7: the full-DILIst exceptions are now reported per matching tier with named drugs (Tier A: norgestrel among defined classes, norethindrone among ambiguous; Tier B adds zopiclone); the norgestrel case is reframed as a DILIst-internal racemate/enantiomer label split (an entity-normalization case study) rather than a same-structure cross-source conflict — DILIrank and DILIst agree on levonorgestrel itself; the armodafinil/tretinoin finding is renamed a benchmark source-provenance discrepancy, with the benchmark rows' stereo-less InChIKeys documented and no cause attributed.</w:t>
       </w:r>
     </w:p>
     <w:p>
@@ -922,7 +922,7 @@
         <w:spacing w:line="360" w:lineRule="auto" w:after="120"/>
       </w:pPr>
       <w:r>
-        <w:t>Of the 49 reclassified drugs, 42 have a resolvable structure and 28 fall inside the Seal gold standard (23 in the 888-compound training set, 5 in the 223-compound held-out set); 14 have structure but are not in Seal, and 7 are unmatchable (biologics/antibodies/peptides). Match quality among the 28 in-Seal drugs was 14 full-InChIKey, 13 InChIKey14-only, and 1 identity-conflict (tretinoin, whose skeleton InChIKey is shared with isotretinoin), so 27 are reliably attributable and 1 is not. The five Tier-B held-out reclassified compounds yielded two positive and three negative predictions at the published threshold. Under strict full-InChIKey matching, only raloxifene and flavoxate remained, and both were predicted positive. These observations are exploratory and are not used for inferential claims; compound-level probabilities are provided in the Supplementary Information (Table S1).</w:t>
+        <w:t>Of the 49 reclassified drugs, 42 have a resolvable structure and 28 fall inside the Seal gold standard (23 in the 888-compound training set, 5 in the 223-compound held-out set); 14 have structure but are not in Seal, and 7 are unmatchable (biologics/antibodies/peptides). Match quality among the 28 in-Seal drugs was 14 full-InChIKey, 13 InChIKey14-only, and 1 identity-conflict (tretinoin, whose skeleton InChIKey is shared with isotretinoin), so 27 are reliably attributable and 1 is not. The five Tier-B held-out reclassified compounds yielded two positive and three negative predictions at the published threshold. Under strict full-InChIKey matching, only raloxifene and flavoxate remained, and both were predicted positive. These observations are exploratory and are not used for inferential claims; compound-level probabilities are provided in the Supplementary Information (Table S1). For the 23 training-set reclassified drugs, out-of-fold predictions computed with the published pipeline's own cross-validation convention — the 4-fold cross_val_predict of the selected final model that the authors themselves use for threshold selection (model selection used all 888 training labels, as in the original pipeline; this convention is disclosed rather than presented as leakage-free) — are 10 positive and 13 negative at the published threshold (Table S2, Supplementary Information). They are reported separately from the held-out predictions and are descriptive only.</w:t>
       </w:r>
     </w:p>
     <w:p>

</xml_diff>

<commit_message>
v0.9: same-entity agreement statistic excluding entity-normalization anomalies; zopiclone marked skeleton-level non-claim
</commit_message>
<xml_diff>
--- a/submission_docx/manuscript.docx
+++ b/submission_docx/manuscript.docx
@@ -21,7 +21,7 @@
         <w:rPr>
           <w:i/>
         </w:rPr>
-        <w:t>Draft v0.8 — research note / data note. Revision v0.7→v0.8: added out-of-fold predictions for the 23 training-set reclassified drugs (Table S2, Supplementary Information), computed with the published pipeline's own cross-validation convention (the 4-fold cross_val_predict of the selected final model that the authors themselves use for threshold selection; model selection used all 888 training labels as in the original pipeline, and this is disclosed rather than presented as leakage-free), reported separately from the held-out predictions and used descriptively only. Not yet submission-ready. All numeric claims below are reproduced from local data by the scripts in `repro/` (see Data availability). No new model was trained and no label was modified. Revision v0.6→v0.7: the full-DILIst exceptions are now reported per matching tier with named drugs (Tier A: norgestrel among defined classes, norethindrone among ambiguous; Tier B adds zopiclone); the norgestrel case is reframed as a DILIst-internal racemate/enantiomer label split (an entity-normalization case study) rather than a same-structure cross-source conflict — DILIrank and DILIst agree on levonorgestrel itself; the armodafinil/tretinoin finding is renamed a benchmark source-provenance discrepancy, with the benchmark rows' stereo-less InChIKeys documented and no cause attributed.</w:t>
+        <w:t>Draft v0.9 — research note / data note. Revision v0.8→v0.9: added the same-entity agreement statistic excluding identified entity-normalization anomalies (707/707 Tier A; 713/713 Tier B), reported alongside the raw counts; the zopiclone match is explicitly marked as skeleton-level evidence that is not claimed as confirmed same-drug; the armodafinil/tretinoin wording is unchanged (causes remain open hypotheses). Revision v0.7→v0.8: added out-of-fold predictions for the 23 training-set reclassified drugs (Table S2, Supplementary Information), computed with the published pipeline's own cross-validation convention (the 4-fold cross_val_predict of the selected final model that the authors themselves use for threshold selection; model selection used all 888 training labels as in the original pipeline, and this is disclosed rather than presented as leakage-free), reported separately from the held-out predictions and used descriptively only. Not yet submission-ready. All numeric claims below are reproduced from local data by the scripts in `repro/` (see Data availability). No new model was trained and no label was modified. Revision v0.6→v0.7: the full-DILIst exceptions are now reported per matching tier with named drugs (Tier A: norgestrel among defined classes, norethindrone among ambiguous; Tier B adds zopiclone); the norgestrel case is reframed as a DILIst-internal racemate/enantiomer label split (an entity-normalization case study) rather than a same-structure cross-source conflict — DILIrank and DILIst agree on levonorgestrel itself; the armodafinil/tretinoin finding is renamed a benchmark source-provenance discrepancy, with the benchmark rows' stereo-less InChIKeys documented and no cause attributed.</w:t>
       </w:r>
     </w:p>
     <w:p>
@@ -71,7 +71,7 @@
         <w:t>Results.</w:t>
       </w:r>
       <w:r>
-        <w:t xml:space="preserve"> Between versions, 0 drugs were removed and 300 were added; 49 were reclassified. All 49 reclassifications ended in a defined concern category; among transitions between defined concern categories, 18 were escalations (no → less) and none were downgrades. The remaining 31 transitions resolved the ambiguous category to a defined concern category (27 to less, 4 to most). In the benchmark, among 559 DILIst-sourced compounds with a DILIrank-1.0 class, the non-ambiguous classes agree with DILIst (476/476) — an agreement that is partly definitional, because DILIst was constructed on top of DILIrank with a stated most/less→positive, no→negative rule [2], and we therefore treat it as a consistency check of that rule rather than independent corroboration. The informative pattern is the ambiguous class: in the matched ambiguous subset of the benchmark, 80 DILIrank-1.0-ambiguous drugs carry a negative label in the DILIst-sourced channel and 30 a positive label in the pre-binarized, DILIrank-derived "CP Overlap" channel; the same directional split holds under strict full-InChIKey matching (44 negative / 17 positive). In the full official DILIst dataset, 836 drugs match DILIrank 1.0 at the structure level: the non-ambiguous classes agree in 707/708 cases under strict full-InChIKey matching and 713/714 in the main analysis; the single non-agreeing case in both tiers is the norgestrel row, which reflects a DILIst-internal label split between a racemate and its enantiomer (norgestrel positive vs levonorgestrel negative — DILIrank and DILIst agree on levonorgestrel itself) rather than a same-structure cross-source conflict. The 122 matched ambiguous drugs carry 120 negative and 2 positive DILIst labels (norethindrone; zopiclone — 121 and 1 positive under strict matching). Two compounds (armodafinil, tretinoin) appear as positive DILIst-sourced rows in the benchmark but are absent from the official DILIst dataset, a source-provenance discrepancy whose cause is not attributed. Of the 49 reclassified drugs, 28 fall inside the Seal gold standard (23 train / 5 held-out); the 5 held-out drugs all carry a "less" label in version 2.0, and their reproduced DILIPredictor probabilities straddle the published Youden threshold (0.6386): 2 predicted positive, 3 negative, and all five lie within 0.22 of equiprobability.</w:t>
+        <w:t xml:space="preserve"> Between versions, 0 drugs were removed and 300 were added; 49 were reclassified. All 49 reclassifications ended in a defined concern category; among transitions between defined concern categories, 18 were escalations (no → less) and none were downgrades. The remaining 31 transitions resolved the ambiguous category to a defined concern category (27 to less, 4 to most). In the benchmark, among 559 DILIst-sourced compounds with a DILIrank-1.0 class, the non-ambiguous classes agree with DILIst (476/476) — an agreement that is partly definitional, because DILIst was constructed on top of DILIrank with a stated most/less→positive, no→negative rule [2], and we therefore treat it as a consistency check of that rule rather than independent corroboration. The informative pattern is the ambiguous class: in the matched ambiguous subset of the benchmark, 80 DILIrank-1.0-ambiguous drugs carry a negative label in the DILIst-sourced channel and 30 a positive label in the pre-binarized, DILIrank-derived "CP Overlap" channel; the same directional split holds under strict full-InChIKey matching (44 negative / 17 positive). In the full official DILIst dataset, 836 drugs match DILIrank 1.0 at the structure level: the non-ambiguous classes agree in 707/708 cases under strict full-InChIKey matching and 713/714 in the main analysis; the single non-agreeing case in both tiers is the norgestrel row, which reflects a DILIst-internal label split between a racemate and its enantiomer (norgestrel positive vs levonorgestrel negative — DILIrank and DILIst agree on levonorgestrel itself) rather than a same-structure cross-source conflict; excluding this identified entity-normalization anomaly, the same-entity agreement is 707/707 and 713/713. The matched ambiguous drugs carry 120 negative and 2 positive DILIst labels (norethindrone; zopiclone — skeleton-level only, not claimed as confirmed same-drug), 121 and 1 positive under strict matching; the two tiers are reported separately rather than merged. Two compounds (armodafinil, tretinoin) appear as positive DILIst-sourced rows in the benchmark but are absent from the official DILIst dataset, a source-provenance discrepancy whose cause is not attributed. Of the 49 reclassified drugs, 28 fall inside the Seal gold standard (23 train / 5 held-out); the 5 held-out drugs all carry a "less" label in version 2.0, and their reproduced DILIPredictor probabilities straddle the published Youden threshold (0.6386): 2 predicted positive, 3 negative, and all five lie within 0.22 of equiprobability.</w:t>
       </w:r>
     </w:p>
     <w:p>
@@ -1414,7 +1414,7 @@
         <w:spacing w:line="360" w:lineRule="auto" w:after="120"/>
       </w:pPr>
       <w:r>
-        <w:t>Of the 1,279 drugs in the official FDA DILIst dataset, 836 match a DILIrank-1.0 drug at the structure level (Table 5); 443 do not — 352 have a PubChem record but no DILIrank-1.0 counterpart (the literature-augmented pool), and 91 have no PubChem record. The non-ambiguous classes agree with DILIst in 707/708 matched cases under strict full-InChIKey matching (Tier A) and in 713/714 in the main analysis (Tier B); the difference between the tiers is carried entirely by the seven InChIKey14-only rows, six of which are class-consistent. The single non-agreeing case is identical in both tiers and is an entity-normalization case rather than a same-structure cross-source conflict: PubChem resolves the DILIst name "norgestrel" to the levonorgestrel compound record, so the row is a full-key match to levonorgestrel (DILIrank class "no"); DILIst labels its norgestrel entry positive and its levonorgestrel entry negative — a DILIst-internal split between a racemate and its enantiomer — while DILIst and DILIrank agree on levonorgestrel itself (negative vs "no"). No other non-ambiguous non-agreement exists at either tier.</w:t>
+        <w:t>Of the 1,279 drugs in the official FDA DILIst dataset, 836 match a DILIrank-1.0 drug at the structure level (Table 5); 443 do not — 352 have a PubChem record but no DILIrank-1.0 counterpart (the literature-augmented pool), and 91 have no PubChem record. The non-ambiguous classes agree with DILIst in 707/708 matched cases under strict full-InChIKey matching (Tier A) and in 713/714 in the main analysis (Tier B); the difference between the tiers is carried entirely by the seven InChIKey14-only rows, six of which are class-consistent. The single non-agreeing case is identical in both tiers and is an entity-normalization case rather than a same-structure cross-source conflict: PubChem resolves the DILIst name "norgestrel" to the levonorgestrel compound record, so the row is a full-key match to levonorgestrel (DILIrank class "no"); DILIst labels its norgestrel entry positive and its levonorgestrel entry negative — a DILIst-internal split between a racemate and its enantiomer — while DILIst and DILIrank agree on levonorgestrel itself (negative vs "no"). No other non-ambiguous non-agreement exists at either tier. Excluding this single identified entity-normalization anomaly, the same-entity defined-class agreement is 707/707 (Tier A) and 713/713 (Tier B); we report both the raw counts and this exclusion-adjusted statistic so the anomaly remains visible as an entity-resolution finding rather than being presented as a label error.</w:t>
       </w:r>
     </w:p>
     <w:p>
@@ -1422,7 +1422,7 @@
         <w:spacing w:line="360" w:lineRule="auto" w:after="120"/>
       </w:pPr>
       <w:r>
-        <w:t>The ambiguous class — the part of the correspondence not determined by DILIst's stated construction rule — is labeled negative in 120 of 122 matched cases in the main analysis, and in 120 of 121 under strict matching. The positive exceptions are tier-specific: norethindrone (full-key match; the synonym norethisterone, a genuine same-drug ambiguous-positive) at both tiers, and zopiclone (InChIKey14-only match to eszopiclone; DILIst itself labels zopiclone positive and eszopiclone negative, a second racemate/enantiomer pair) at Tier B only. This same-drug evidence is consistent with, and extends, the benchmark-level observation: the DILIst-side treatment of the ambiguous class is overwhelmingly negative (120/122), while the 30 positive ambiguous labels in the benchmark arrive exclusively through the "CP Overlap" channel.</w:t>
+        <w:t>The ambiguous class — the part of the correspondence not determined by DILIst's stated construction rule — is labeled negative in 120 of 122 matched cases in the main analysis, and in 120 of 121 under strict matching. The positive exceptions are tier-specific: norethindrone (full-key match; the synonym norethisterone, a genuine same-drug ambiguous-positive) at both tiers, and zopiclone (InChIKey14-only match to eszopiclone — skeleton-level evidence for the sensitivity analysis that is not claimed as confirmed same-drug; DILIst itself labels zopiclone positive and eszopiclone negative, a second racemate/enantiomer pair) at Tier B only. This same-drug evidence is consistent with, and extends, the benchmark-level observation: the DILIst-side treatment of the ambiguous class is overwhelmingly negative (120/122), while the 30 positive ambiguous labels in the benchmark arrive exclusively through the "CP Overlap" channel.</w:t>
       </w:r>
     </w:p>
     <w:p>
@@ -1669,13 +1669,24 @@
           </w:tcPr>
           <w:p>
             <w:r>
-              <w:t>norethindrone (full key; synonym norethisterone) at both tiers; zopiclone (InChIKey14-only; DILIst-internal zopiclone 1 vs eszopiclone 0) at Tier B only</w:t>
+              <w:t>norethindrone (full key; synonym norethisterone) at both tiers; zopiclone (InChIKey14-only, skeleton-level only — not claimed as confirmed same-drug; DILIst-internal zopiclone 1 vs eszopiclone 0) at Tier B only</w:t>
             </w:r>
           </w:p>
         </w:tc>
       </w:tr>
     </w:tbl>
     <w:p/>
+    <w:p>
+      <w:pPr>
+        <w:spacing w:line="360" w:lineRule="auto" w:after="120"/>
+      </w:pPr>
+      <w:r>
+        <w:rPr>
+          <w:i/>
+        </w:rPr>
+        <w:t>Same-entity defined-class agreement excluding the identified entity-normalization anomaly (the norgestrel row): 707/707 (Tier A) and 713/713 (Tier B).</w:t>
+      </w:r>
+    </w:p>
     <w:p>
       <w:pPr>
         <w:pStyle w:val="Heading1"/>
@@ -1707,7 +1718,7 @@
         <w:t>not uniform</w:t>
       </w:r>
       <w:r>
-        <w:t xml:space="preserve"> — it is confined to the ambiguous class, and it is directional in the shipped benchmark (DILIst-sourced channel → negative, "CP Overlap" channel → positive); strict Tier-A matching surfaces a single non-ambiguous discordance instead (Table 4). The 476/476 non-ambiguous agreement must be read with its construction caveat: DILIst was built on top of DILIrank with an explicit most/less→positive, no→negative rule [2], so that agreement is a consistency check of the rule. The same-drug comparison across the full official DILIst dataset (§3.5) shows that the construction-consistent core holds at full scale (707/708 strict; 713/714 main), that the single non-ambiguous non-agreeing case is a DILIst-internal racemate/enantiomer label split rather than a same-structure cross-source conflict, that the ambiguous class is labeled negative in 120 of 122 same-drug matched cases with two named, tier-specific exceptions, and that the benchmark's DILIst-sourced rows are not identical to the official dataset — two benchmark rows (armodafinil, tretinoin) have no counterpart in the official DILIst release, a source-provenance discrepancy. We characterize these distributions empirically and do not interpret them as violations of any documented rule, because the upstream binarization of the "CP Overlap" subset is undocumented; nor do we claim to adjudicate which source is correct. Third, the common shortcut of silently dropping or binary-flattening the ambiguous class does not remove the problem; it relocates it, in a source-dependent direction, into the training labels of the benchmark. The direction of that treatment is a property of the channel, not of the drug.</w:t>
+        <w:t xml:space="preserve"> — it is confined to the ambiguous class, and it is directional in the shipped benchmark (DILIst-sourced channel → negative, "CP Overlap" channel → positive); strict Tier-A matching surfaces a single non-ambiguous discordance instead (Table 4). The 476/476 non-ambiguous agreement must be read with its construction caveat: DILIst was built on top of DILIrank with an explicit most/less→positive, no→negative rule [2], so that agreement is a consistency check of the rule. The same-drug comparison across the full official DILIst dataset (§3.5) shows that the construction-consistent core holds at full scale (707/708 strict; 713/714 main; 707/707 and 713/713 excluding the single identified entity-normalization anomaly), that the non-ambiguous non-agreeing case is a DILIst-internal racemate/enantiomer label split rather than a same-structure cross-source conflict, that the ambiguous class is labeled negative in 120 of 122 same-drug matched cases with two named, tier-specific exceptions, and that the benchmark's DILIst-sourced rows are not identical to the official dataset — two benchmark rows (armodafinil, tretinoin) have no counterpart in the official DILIst release, a source-provenance discrepancy. We characterize these distributions empirically and do not interpret them as violations of any documented rule, because the upstream binarization of the "CP Overlap" subset is undocumented; nor do we claim to adjudicate which source is correct. Third, the common shortcut of silently dropping or binary-flattening the ambiguous class does not remove the problem; it relocates it, in a source-dependent direction, into the training labels of the benchmark. The direction of that treatment is a property of the channel, not of the drug.</w:t>
       </w:r>
     </w:p>
     <w:p>
@@ -1747,7 +1758,7 @@
         <w:t>independence of the two sources is not demonstrated</w:t>
       </w:r>
       <w:r>
-        <w:t xml:space="preserve"> anywhere in this audit, and the cause of the benchmark-vs-official discrepancies (armodafinil, tretinoin) is not attributed. (viii) The non-ambiguous non-agreeing case (norgestrel/levonorgestrel) and one ambiguous-positive case (zopiclone/eszopiclone) involve racemate/enantiomer pairs whose identity resolution depends on the PubChem records used; the DILIst-internal label opposition within each pair is verifiable directly from the official workbook, and neither is presented as a same-structure cross-source conflict.</w:t>
+        <w:t xml:space="preserve"> anywhere in this audit, and the cause of the benchmark-vs-official discrepancies (armodafinil, tretinoin) is not attributed. (viii) The non-ambiguous non-agreeing case (norgestrel/levonorgestrel) and one ambiguous-positive case (zopiclone/eszopiclone) involve racemate/enantiomer pairs whose identity resolution depends on the PubChem records used; the DILIst-internal label opposition within each pair is verifiable directly from the official workbook, neither is presented as a same-structure cross-source conflict, and the zopiclone match is skeleton-level only and not claimed as confirmed same-drug evidence.</w:t>
       </w:r>
     </w:p>
     <w:p>

</xml_diff>

<commit_message>
v1.0 submission-clean: internal consistency fixes, i-DILI/CT-2026 repositioning, SI Table S3, figure captions, draft artifacts stripped
</commit_message>
<xml_diff>
--- a/submission_docx/manuscript.docx
+++ b/submission_docx/manuscript.docx
@@ -11,17 +11,6 @@
           <w:sz w:val="32"/>
         </w:rPr>
         <w:t>Version drift and source-dependent binary labeling of ambiguous drugs in a drug-induced liver injury benchmark: a provenance audit</w:t>
-      </w:r>
-    </w:p>
-    <w:p>
-      <w:pPr>
-        <w:spacing w:line="276" w:lineRule="auto"/>
-      </w:pPr>
-      <w:r>
-        <w:rPr>
-          <w:i/>
-        </w:rPr>
-        <w:t>Draft v0.9 — research note / data note. Revision v0.8→v0.9: added the same-entity agreement statistic excluding identified entity-normalization anomalies (707/707 Tier A; 713/713 Tier B), reported alongside the raw counts; the zopiclone match is explicitly marked as skeleton-level evidence that is not claimed as confirmed same-drug; the armodafinil/tretinoin wording is unchanged (causes remain open hypotheses). Revision v0.7→v0.8: added out-of-fold predictions for the 23 training-set reclassified drugs (Table S2, Supplementary Information), computed with the published pipeline's own cross-validation convention (the 4-fold cross_val_predict of the selected final model that the authors themselves use for threshold selection; model selection used all 888 training labels as in the original pipeline, and this is disclosed rather than presented as leakage-free), reported separately from the held-out predictions and used descriptively only. Not yet submission-ready. All numeric claims below are reproduced from local data by the scripts in `repro/` (see Data availability). No new model was trained and no label was modified. Revision v0.6→v0.7: the full-DILIst exceptions are now reported per matching tier with named drugs (Tier A: norgestrel among defined classes, norethindrone among ambiguous; Tier B adds zopiclone); the norgestrel case is reframed as a DILIst-internal racemate/enantiomer label split (an entity-normalization case study) rather than a same-structure cross-source conflict — DILIrank and DILIst agree on levonorgestrel itself; the armodafinil/tretinoin finding is renamed a benchmark source-provenance discrepancy, with the benchmark rows' stereo-less InChIKeys documented and no cause attributed.</w:t>
       </w:r>
     </w:p>
     <w:p>
@@ -57,7 +46,7 @@
         <w:t>Methods.</w:t>
       </w:r>
       <w:r>
-        <w:t xml:space="preserve"> We aligned the two U.S. FDA releases of DILIrank (1.0, n = 1,036; 2.0, n = 1,336) by LTKB identifier, and cross-matched the result against the 1,111-compound gold standard of Seal et al. (2024), the publicly released DILIPredictor benchmark, using PubChem InChIKey bridging. Match quality was stratified into full-InChIKey, InChIKey14-only, identity-conflict, and unmatchable, and all cross-source statistics were recomputed under three matching tiers (strict full-InChIKey; full + InChIKey14; and excluding identity conflicts) as a sensitivity analysis. We further matched the full official FDA DILIst dataset (1,279 drugs) against DILIrank 1.0 for a same-drug comparison. No model was retrained; the only prediction-level evidence is the previously reproduced 223-compound held-out probability vector of the Seal et al. model.</w:t>
+        <w:t xml:space="preserve"> We aligned the two U.S. FDA releases of DILIrank (1.0, n = 1,036; 2.0, n = 1,336) by LTKB identifier, and cross-matched the result against the 1,111-compound gold standard of Seal et al. (2024), the publicly released DILIPredictor benchmark, using PubChem InChIKey bridging. Match quality was stratified into full-InChIKey, InChIKey14-only, identity-conflict, and unmatchable, and all cross-source statistics were recomputed under three matching tiers (strict full-InChIKey; full + InChIKey14; and excluding identity conflicts) as a sensitivity analysis. We further matched the full official FDA DILIst dataset (1,279 drugs) against DILIrank 1.0 for a same-drug comparison. No model was retrained. Prediction-level evidence consists of the previously reproduced 223-compound held-out probability vector of the Seal et al. model and out-of-fold predictions for the 23 training-set reclassified drugs, computed with the published pipeline's own cross-validation convention (Supplementary Information, Table S2) and reported separately from the held-out predictions.</w:t>
       </w:r>
     </w:p>
     <w:p>
@@ -127,16 +116,7 @@
         <w:t>cross-source disagreement</w:t>
       </w:r>
       <w:r>
-        <w:t xml:space="preserve">: when multiple sources are merged into one training set, the same drug can carry contradictory labels depending on which source is treated as authoritative. A recent multi-source database, i-DILI, quantified pairwise agreement with Cohen's kappa and introduced a confidence score, but explicitly </w:t>
-      </w:r>
-      <w:r>
-        <w:rPr>
-          <w:b/>
-        </w:rPr>
-        <w:t>drops</w:t>
-      </w:r>
-      <w:r>
-        <w:t xml:space="preserve"> DILIrank's ambiguous class and works only from version 2.0 [4]. A related study used DILIrank 2.0's 300 added drugs as a temporal test, but its subject was feature representation, not label stability [5]. Recent perspectives note that DILI dataset annotation rules differ across resources and that models can learn different definitions of DILI positivity [9].</w:t>
+        <w:t>: when multiple sources are merged into one training set, the same drug can carry contradictory labels depending on which source is treated as authoritative. A recent multi-source database, i-DILI, reports Cohen's kappa = 0.888 over 480 drugs shared between its DILIrank-derived and DILIst-derived labels, under a most/less→positive, no→negative binarization with the ambiguous class excluded, and works only from version 2.0 [4]. A related study used DILIrank 2.0's 300 added drugs as a temporal test, but its subject was feature representation, not label stability [5]. Recent perspectives note that DILI dataset annotation rules differ across resources and that models can learn different definitions of DILI positivity [9].</w:t>
       </w:r>
     </w:p>
     <w:p>
@@ -144,7 +124,7 @@
         <w:spacing w:line="360" w:lineRule="auto" w:after="120"/>
       </w:pPr>
       <w:r>
-        <w:t>Here we do not build a new database or a new predictor. We audit the labels themselves: (i) how many drugs changed class between DILIrank 1.0 and 2.0, and in which direction; (ii) how compounds classified as ambiguous in DILIrank 1.0 carry binary labels across two disjoint source channels in a published benchmark — the Seal et al. (2024) gold standard [6] — and how the resulting label distribution depends on source provenance; (iii) how the same drugs are labeled in the full official DILIst dataset, as a same-drug comparison rather than a channel-level comparison; and (iv) what the reclassified compounds that survive into that benchmark's held-out set look like under the reproduced model. Prior work has examined how the choice of features, endpoints, and negative-sample definitions affects reported DILI model performance [7]; to our knowledge, neither the direction of version drift nor the source-dependent binary labeling of DILIrank's ambiguous class has been quantified. Our contribution is limited to checkable, quantitative facts about label provenance — the directionally asymmetric reclassification pattern of the 1.0→2.0 update, the specific path by which compounds classified as ambiguous in DILIrank 1.0 arrive in a published benchmark with binary labels, and the same-drug label correspondence between DILIrank 1.0 and the full DILIst dataset — reported as a descriptive, reproducible characterization that supports "benchmark hygiene" decisions, not a claim of improved prediction.</w:t>
+        <w:t>Here we do not build a new database or a new predictor. We audit the labels themselves: (i) how many drugs changed class between DILIrank 1.0 and 2.0, and in which direction; (ii) how compounds classified as ambiguous in DILIrank 1.0 carry binary labels across two disjoint source channels in a published benchmark — the Seal et al. (2024) gold standard [6] — and how the resulting label distribution depends on source provenance; (iii) how the same drugs are labeled in the full official DILIst dataset, as a same-drug comparison rather than a channel-level comparison; and (iv) what the reclassified compounds that survive into that benchmark's held-out set look like under the reproduced model. Prior work has examined how the choice of features, endpoints, and negative-sample definitions affects reported DILI model performance [7], and i-DILI's binarized overlap comparison drops the ambiguous class [4]; to our knowledge, the direction of the 1.0→2.0 reclassification (preserving the four-category semantics) and the source-dependent binary labeling of the ambiguous class have not been quantified. Our contribution is limited to checkable, quantitative facts about label provenance — the directionally asymmetric reclassification pattern of the 1.0→2.0 update, the specific path by which compounds classified as ambiguous in DILIrank 1.0 arrive in a published benchmark with binary labels, and the same-drug label correspondence between DILIrank 1.0 and the full DILIst dataset — reported as a descriptive, reproducible characterization that supports "benchmark hygiene" decisions, not a claim of improved prediction.</w:t>
       </w:r>
     </w:p>
     <w:p>
@@ -222,7 +202,7 @@
         <w:t>Full-DILIst same-drug comparison.</w:t>
       </w:r>
       <w:r>
-        <w:t xml:space="preserve"> The official FDA DILIst workbook (1,279 drugs; 768 positive / 511 negative) was downloaded from the FDA DILIst dataset page and matched to DILIrank 1.0 by structure. Names already covered by our PubChem pass were reused; the remaining 455 names were resolved via PubChem PUG REST (name → CID with salt-suffix-stripped fallbacks; 364 resolved, 91 without a PubChem record). Matching used the same full-InChIKey-priority rule as the benchmark analysis; because both sides resolve through PubChem canonical keys, the identity-conflict screen of the benchmark analysis does not arise here. Results are reported separately from the benchmark subset: the benchmark's DILIst-sourced rows are an upstream snapshot and are not the same object as the full official DILIst dataset.</w:t>
+        <w:t xml:space="preserve"> The official FDA DILIst workbook (1,279 drugs; 768 positive / 511 negative) was downloaded from the FDA DILIst dataset page and matched to DILIrank 1.0 by structure. Names already covered by our PubChem pass were reused; the remaining 455 names were resolved via PubChem PUG REST (name → CID with salt-suffix-stripped fallbacks; 364 resolved, 91 unresolved by this procedure). Matching used the same full-InChIKey-priority rule as the benchmark analysis; because both sides resolve through PubChem canonical keys, the identity-conflict screen of the benchmark analysis does not arise here. Results are reported separately from the benchmark subset: the benchmark's DILIst-sourced rows are an upstream snapshot and are not the same object as the full official DILIst dataset.</w:t>
       </w:r>
     </w:p>
     <w:p>
@@ -313,7 +293,7 @@
         <w:t>Predictions.</w:t>
       </w:r>
       <w:r>
-        <w:t xml:space="preserve"> Only the already-reproduced 223-compound held-out probability vector of the Seal et al. FeatureNet model was used (verified against the authors' published predictions to floating-point precision in earlier work; see Data availability). The Youden threshold (0.6386) is the published value reported by Seal et al. [6]; it was not refitted on the held-out set for this work. No model was trained or re-run, and no training-set prediction was used to characterize generalization.</w:t>
+        <w:t xml:space="preserve"> Only the already-reproduced 223-compound held-out probability vector of the Seal et al. FeatureNet model was used (verified against the authors' published predictions to floating-point precision in earlier work; see Data availability). The Youden threshold (0.6386) is the published value reported by Seal et al. [6]; it was not refitted on the held-out set for this work. No model was trained or re-run. Out-of-fold predictions for the 23 training-set reclassified drugs use the published pipeline's own cross-validation convention — the 4-fold cross_val_predict of the selected final model that the authors themselves use for threshold selection; model selection used all 888 training labels, as in the original pipeline, and this is disclosed rather than presented as leakage-free (Table S2).</w:t>
       </w:r>
     </w:p>
     <w:p>
@@ -337,7 +317,7 @@
         <w:spacing w:line="360" w:lineRule="auto" w:after="120"/>
       </w:pPr>
       <w:r>
-        <w:t>Aligning DILIrank 1.0 and 2.0 by LTKBID recovers the published claim exactly: 0 drugs removed, 300 added, 49 reclassified (Table 1). The reclassification pattern is directionally asymmetric rather than uniformly upward across all four labels: eighteen drugs moved from no to less DILI concern, an escalation within the defined concern categories, and 31 drugs moved from the ambiguous category to a defined concern category (27 to less, 4 to most). Because FDA defines Ambiguous-DILI-concern as a category of undetermined causality [3], the latter transitions are resolutions of classification uncertainty, not ordinal severity upgrades. No drug moved from a defined concern category to a lower defined concern category.</w:t>
+        <w:t>Aligning DILIrank 1.0 and 2.0 by LTKBID recovers the published claim exactly: 0 drugs removed, 300 added, 49 reclassified (Table 1). The reclassification pattern is directionally asymmetric rather than uniformly upward across all four labels: eighteen drugs moved from no to less DILI concern, an escalation within the defined concern categories, and 31 drugs moved from the ambiguous category to a defined concern category (27 to less, 4 to most). Because FDA defines Ambiguous-DILI-concern as a category of undetermined causality [3], the latter transitions are resolutions of classification uncertainty, not ordinal severity upgrades. No drug moved from a defined concern category to a lower defined concern category (Figure 1).</w:t>
       </w:r>
     </w:p>
     <w:p>
@@ -588,7 +568,7 @@
         <w:t>Layer 3 — the ambiguous class, which the stated rules do not determine.</w:t>
       </w:r>
       <w:r>
-        <w:t xml:space="preserve"> In the Tier-B primary analysis, all disagreement in the matched set is confined to the ambiguous class, and it is directional in the shipped benchmark (under strict Tier-A matching, a single non-ambiguous discordance appears instead; Table 4). In the DILIst-sourced channel, every tallied ambiguous drug (80) is negative; in the DILIrank-derived "CP Overlap" channel (89 matched, 1 identity-conflict row excluded), every tallied ambiguous drug (30) is positive. Seal et al. describe their DILIrank-sourced labels as mapping most/less to positive and no to negative, with ambiguous excluded [6]; the shipped benchmark nonetheless carries binary labels for all 110 tallied compounds that DILIrank 1.0 classifies as ambiguous. Because the upstream rule of the "CP Overlap" subset is not documented in the repository, we characterize this distribution empirically and do not attribute the labels to any documented rule; and because the two channels are disjoint (Source_rank is mutually exclusive), this is a property of the benchmark's shipped label distribution rather than a same-drug comparison across two adjudications. §3.5 reports the same-drug comparison across the full official DILIst dataset.</w:t>
+        <w:t xml:space="preserve"> In the Tier-B primary analysis, all disagreement in the matched set is confined to the ambiguous class, and it is directional in the shipped benchmark (under strict Tier-A matching, a single non-ambiguous discordance appears instead; Table 4). In the DILIst-sourced channel, every tallied ambiguous drug (80) is negative; in the DILIrank-derived "CP Overlap" channel (89 matched, 1 identity-conflict row excluded), every tallied ambiguous drug (30) is positive. Seal et al. describe their DILIrank-sourced labels as mapping most/less to positive and no to negative, with ambiguous excluded [6]; the shipped benchmark nonetheless carries binary labels for all 110 tallied compounds that DILIrank 1.0 classifies as ambiguous. Because the upstream rule of the "CP Overlap" subset is not documented in the repository, we characterize this distribution empirically and do not attribute the labels to any documented rule; and because the two channels are disjoint (Source_rank is mutually exclusive), this is a property of the benchmark's shipped label distribution rather than a same-drug comparison across two adjudications. §3.5 reports the same-drug comparison across the full official DILIst dataset. Figure 2 summarizes the filtering steps.</w:t>
       </w:r>
     </w:p>
     <w:p>
@@ -1414,7 +1394,7 @@
         <w:spacing w:line="360" w:lineRule="auto" w:after="120"/>
       </w:pPr>
       <w:r>
-        <w:t>Of the 1,279 drugs in the official FDA DILIst dataset, 836 match a DILIrank-1.0 drug at the structure level (Table 5); 443 do not — 352 have a PubChem record but no DILIrank-1.0 counterpart (the literature-augmented pool), and 91 have no PubChem record. The non-ambiguous classes agree with DILIst in 707/708 matched cases under strict full-InChIKey matching (Tier A) and in 713/714 in the main analysis (Tier B); the difference between the tiers is carried entirely by the seven InChIKey14-only rows, six of which are class-consistent. The single non-agreeing case is identical in both tiers and is an entity-normalization case rather than a same-structure cross-source conflict: PubChem resolves the DILIst name "norgestrel" to the levonorgestrel compound record, so the row is a full-key match to levonorgestrel (DILIrank class "no"); DILIst labels its norgestrel entry positive and its levonorgestrel entry negative — a DILIst-internal split between a racemate and its enantiomer — while DILIst and DILIrank agree on levonorgestrel itself (negative vs "no"). No other non-ambiguous non-agreement exists at either tier. Excluding this single identified entity-normalization anomaly, the same-entity defined-class agreement is 707/707 (Tier A) and 713/713 (Tier B); we report both the raw counts and this exclusion-adjusted statistic so the anomaly remains visible as an entity-resolution finding rather than being presented as a label error.</w:t>
+        <w:t>Of the 1,279 drugs in the official FDA DILIst dataset, 836 match a DILIrank-1.0 drug at the structure level (Table 5); 443 do not — 352 have a PubChem record but no DILIrank-1.0 counterpart (the literature-augmented pool), and 91 remained unresolved by the specified PubChem lookup procedure (name → CID with salt-suffix-stripped fallback). The non-ambiguous classes agree with DILIst in 707/708 matched cases under strict full-InChIKey matching (Tier A) and in 713/714 in the main analysis (Tier B); the difference between the tiers is carried entirely by the seven InChIKey14-only rows, six of which are class-consistent. The single non-agreeing case is identical in both tiers and is an entity-normalization case rather than a same-structure cross-source conflict: PubChem resolves the DILIst name "norgestrel" to the levonorgestrel compound record, so the row is a full-key match to levonorgestrel (DILIrank class "no"); DILIst labels its norgestrel entry positive and its levonorgestrel entry negative — a DILIst-internal split between a racemate and its enantiomer — while DILIst and DILIrank agree on levonorgestrel itself (negative vs "no"). No other non-ambiguous non-agreement exists at either tier. Excluding this single identified entity-normalization anomaly, the same-entity defined-class agreement is 707/707 (Tier A) and 713/713 (Tier B); we report both the raw counts and this exclusion-adjusted statistic so the anomaly remains visible as an entity-resolution finding rather than being presented as a label error.</w:t>
       </w:r>
     </w:p>
     <w:p>
@@ -1726,7 +1706,7 @@
         <w:spacing w:line="360" w:lineRule="auto" w:after="120"/>
       </w:pPr>
       <w:r>
-        <w:t>Our findings are complementary to, and deliberately narrower than, i-DILI [4], which harmonizes seven sources into one binary label with a confidence score but drops the ambiguous class and uses only DILIrank 2.0; and StateFlux [5], which used the 300 added drugs as a temporal test for feature representations. We do not claim those works are incomplete; we claim checkable, quantitative facts about label provenance that neither reports: the directionally asymmetric reclassification pattern of the 1.0→2.0 update, the specific path by which compounds classified as ambiguous in DILIrank 1.0 arrive in a published benchmark with binary labels, and the same-drug label correspondence between DILIrank 1.0 and the full official DILIst dataset. All remain descriptive statements about data provenance; they do not require, and we do not offer, a claim that any benchmark's labels are wrong or that any model's performance is misreported.</w:t>
+        <w:t>Our findings are complementary to, and deliberately narrower than, i-DILI [4], which harmonizes seven sources into one binary label with a confidence score, reports kappa = 0.888 over 480 shared drugs under a most/less→positive, no→negative binarization that drops the ambiguous class, and uses only DILIrank 2.0; and StateFlux [5], which used the 300 added drugs as a temporal test for feature representations. Our 836 matched drugs and i-DILI's 480 shared drugs are not directly comparable counts: i-DILI derives labels from DILIrank 2.0 with an ambiguous-excluding binarization, whereas we matched the full official DILIst workbook against DILIrank 1.0 by structure while preserving the four classes (Table S3). The difference reflects design choices, not a contradiction, and we do not present it as evidence of novelty. A same-journal study systematically evaluated how generic curation steps, stereochemical handling, and label-conflict policies across 12 toxicity and ADME endpoints alter modeling data and model performance [10]. Its object is the curation pipeline for QSAR modeling across endpoints; ours is the version drift and source-dependent labeling of one DILI-specific reference-label system, without any model-performance claims. We therefore do not claim that label provenance matters or that stereochemical matching can change results as novel points — those are established [10]; our contribution is the specific, checkable accounting for the DILI reference labels. We do not claim i-DILI, StateFlux, or [10] are incomplete; we claim checkable, quantitative facts about label provenance that neither reports: the directionally asymmetric reclassification pattern of the 1.0→2.0 update, the specific path by which compounds classified as ambiguous in DILIrank 1.0 arrive in a published benchmark with binary labels, and the same-drug label correspondence between DILIrank 1.0 and the full official DILIst dataset. All remain descriptive statements about data provenance; they do not require, and we do not offer, a claim that any benchmark's labels are wrong or that any model's performance is misreported.</w:t>
       </w:r>
     </w:p>
     <w:p>
@@ -1740,7 +1720,7 @@
         <w:t>Limitations.</w:t>
       </w:r>
       <w:r>
-        <w:t xml:space="preserve"> (i) Structure bridging is InChIKey-based; the mapping pass stored no SMILES, so a SMILES-level cross-check was unavailable, and 13 of 28 in-Seal matches are InChIKey14-only (Seal stores `-UHFFFAOYSA-`), so their stereo identity is unverified; the Tier-A column of Table 4 bounds the effect of this choice. (ii) One in-Seal reclassified drug (tretinoin) shares a skeleton InChIKey with another DILIrank drug and cannot be uniquely attributed. (iii) Only 559 of the 990 DILIst-sourced rows and 89 of the 121 "CP Overlap"-sourced rows could be matched to a DILIrank-1.0 class, so the benchmark agreement matrix covers the matched subset; the 431 and 32 outside rows are outside the audit by construction. In the full-DILIst comparison, 443 of 1,279 DILIst drugs fall outside DILIrank 1.0 (352 with structure, 91 without a PubChem record) and carry no comparable class. (iv) The held-out reclassified sample is n = 5 (n = 2 under strict matching), so the model-behaviour portion is exploratory only and is reported in the Supplementary Information; the 23 training-set reclassified drugs lack out-of-fold predictions and were not used. (v) We did not verify that DILIrank-1.0 labels themselves are "correct" against primary literature; we characterize </w:t>
+        <w:t xml:space="preserve"> (i) Structure bridging is InChIKey-based; the mapping pass stored no SMILES, so a SMILES-level cross-check was unavailable, and 13 of 28 in-Seal matches are InChIKey14-only (Seal stores `-UHFFFAOYSA-`), so their stereo identity is unverified; the Tier-A column of Table 4 bounds the effect of this choice. (ii) One in-Seal reclassified drug (tretinoin) shares a skeleton InChIKey with another DILIrank drug and cannot be uniquely attributed. (iii) Only 559 of the 990 DILIst-sourced rows and 89 of the 121 "CP Overlap"-sourced rows could be matched to a DILIrank-1.0 class, so the benchmark agreement matrix covers the matched subset; the 431 and 32 outside rows are outside the audit by construction. In the full-DILIst comparison, 443 of 1,279 DILIst drugs fall outside DILIrank 1.0 (352 with structure, 91 without a PubChem record) and carry no comparable class. (iv) The prediction-level evidence is descriptive only: 5 held-out reclassified drugs (2 under strict matching; Table S1) and 23 training-set reclassified drugs with out-of-fold predictions computed under the published pipeline's cross-validation convention, in which model selection used all training labels (disclosed rather than leakage-free; Table S2). The two groups are reported separately, are not pooled, and support no inferential claims. (v) We did not verify that DILIrank-1.0 labels themselves are "correct" against primary literature; we characterize </w:t>
       </w:r>
       <w:r>
         <w:rPr>
@@ -1788,7 +1768,7 @@
         <w:spacing w:line="360" w:lineRule="auto" w:after="120"/>
       </w:pPr>
       <w:r>
-        <w:t>The full per-drug match table (Tier B; all matched drugs with class, channel, toxicity, match tier, and conflict flag), the 49-row reclassification table, the sensitivity summary, the full-DILIst per-drug match table and agreement matrices, the PubChem lookup records for the 455 additional DILIst names (including salt-stripped variants and no-hit names), and an input manifest (paths, sizes, sha256, sources) are generated by `repro/generate_analysis.py` and `repro/full_dilist_comparison.py` (Python 3.10, pandas) from the raw inputs listed in the manifest, and are provided in `repro_outputs/`. The previously produced per-drug alignment table for the 49 reclassified drugs remains at `d2_pilot/D2_label_stability_alignment.csv`. A versioned public repository is available at https://github.com/mengyufanqiu-maker/-dili-label-provenance-audit. DILIrank versions and the DILIst dataset are the official FDA workbooks (FDA DILIrank 2.0 and DILIst dataset pages); the Seal et al. gold standard and split files are from the authors' public repository [6]; the held-out probability vector and the 0.6386 Youden threshold come from our earlier reproduction of the Seal et al. pipeline, verified against the authors' published predictions. Table S1 is in the Supplementary Information.</w:t>
+        <w:t>The full per-drug match table (Tier B; all matched drugs with class, channel, toxicity, match tier, and conflict flag), the 49-row reclassification table, the sensitivity summary, the full-DILIst per-drug match table and agreement matrices, the PubChem lookup records for the 455 additional DILIst names (including salt-stripped variants and no-hit names), and an input manifest (paths, sizes, sha256, sources) are generated by `repro/generate_analysis.py` and `repro/full_dilist_comparison.py` (Python 3.10, pandas) from the raw inputs listed in the manifest, and are provided in `repro_outputs/`. The per-drug alignment table for the 49 reclassified drugs is provided as `data/D2_label_stability_alignment.csv` in the repository. A versioned public repository is available at https://github.com/mengyufanqiu-maker/-dili-label-provenance-audit. DILIrank versions and the DILIst dataset are the official FDA workbooks (FDA DILIrank 2.0 and DILIst dataset pages); the Seal et al. gold standard and split files are from the authors' public repository [6]; the held-out probability vector and the 0.6386 Youden threshold come from our earlier reproduction of the Seal et al. pipeline, verified against the authors' published predictions. Tables S1–S3 are in the Supplementary Information.</w:t>
       </w:r>
     </w:p>
     <w:p>
@@ -1864,7 +1844,7 @@
         <w:t>Preprints.org</w:t>
       </w:r>
       <w:r>
-        <w:t xml:space="preserve"> 2026. doi:10.20944/preprints202609.0517.v1.</w:t>
+        <w:t xml:space="preserve"> 2026 (preprint, not peer-reviewed). doi:10.20944/preprints202609.0517.v1.</w:t>
       </w:r>
     </w:p>
     <w:p>
@@ -1954,13 +1934,19 @@
     </w:p>
     <w:p>
       <w:pPr>
-        <w:spacing w:line="276" w:lineRule="auto"/>
+        <w:spacing w:line="360" w:lineRule="auto" w:after="120"/>
       </w:pPr>
+      <w:r>
+        <w:t xml:space="preserve">10. Standardized toxicity data curation pipeline: a systematic evaluation of data quality control on QSAR model reproducibility and reliability. </w:t>
+      </w:r>
       <w:r>
         <w:rPr>
           <w:i/>
         </w:rPr>
-        <w:t>Remaining before submission: confirm author lists for refs 1–3, 6, and 9 against PubMed and format per the target journal's style; renumber citations per the target journal's style; replace markdown tables with journal table format. Figures 1–2 (reclassification directions; cross-source filtering) are provided as `figures/fig1_reclassification_directions.png` and `figures/fig2_cross_source_filtering.png`; a figure for Table 5 can be added at formatting stage.</w:t>
+        <w:t>Comput Toxicol</w:t>
+      </w:r>
+      <w:r>
+        <w:t xml:space="preserve"> 2026;39:100444. doi:10.1016/j.comtox.2026.100444.</w:t>
       </w:r>
     </w:p>
     <w:sectPr>

</xml_diff>

<commit_message>
v1.0 final: generative-AI use statement in Methods, RGB print-safe figures, accurate AI disclosure in checklist and cover letter
</commit_message>
<xml_diff>
--- a/submission_docx/manuscript.docx
+++ b/submission_docx/manuscript.docx
@@ -294,6 +294,20 @@
       </w:r>
       <w:r>
         <w:t xml:space="preserve"> Only the already-reproduced 223-compound held-out probability vector of the Seal et al. FeatureNet model was used (verified against the authors' published predictions to floating-point precision in earlier work; see Data availability). The Youden threshold (0.6386) is the published value reported by Seal et al. [6]; it was not refitted on the held-out set for this work. No model was trained or re-run. Out-of-fold predictions for the 23 training-set reclassified drugs use the published pipeline's own cross-validation convention — the 4-fold cross_val_predict of the selected final model that the authors themselves use for threshold selection; model selection used all 888 training labels, as in the original pipeline, and this is disclosed rather than presented as leakage-free (Table S2).</w:t>
+      </w:r>
+    </w:p>
+    <w:p>
+      <w:pPr>
+        <w:spacing w:line="360" w:lineRule="auto" w:after="120"/>
+      </w:pPr>
+      <w:r>
+        <w:rPr>
+          <w:b/>
+        </w:rPr>
+        <w:t>Generative AI use.</w:t>
+      </w:r>
+      <w:r>
+        <w:t xml:space="preserve"> Generative AI (Claude, Anthropic) was used during the preparation of this work: to assist research positioning and literature review, to draft and revise manuscript text across multiple versions, for language editing, and to generate and debug the reproduction and analysis scripts (`repro/generate_analysis.py`, `repro/full_dilist_comparison.py`, `repro/make_figures.py`, and the document converter). The audit design and its analytical decisions were developed through iterative expert reviews of successive drafts, with every finding verified by the authors against local data and public sources before inclusion. All data, all numerical results, and all analyses were produced by the authors' own scripts; the authors reviewed every claim in the final text and take full responsibility for the content.</w:t>
       </w:r>
     </w:p>
     <w:p>

</xml_diff>

<commit_message>
Unify no-new-model wording with cross-validation-derived scores; README model statement and SI description updated
</commit_message>
<xml_diff>
--- a/submission_docx/manuscript.docx
+++ b/submission_docx/manuscript.docx
@@ -46,7 +46,7 @@
         <w:t>Methods.</w:t>
       </w:r>
       <w:r>
-        <w:t xml:space="preserve"> We aligned the two U.S. FDA releases of DILIrank (1.0, n = 1,036; 2.0, n = 1,336) by LTKB identifier, and cross-matched the result against the 1,111-compound gold standard of Seal et al. (2024), the publicly released DILIPredictor benchmark, using PubChem InChIKey bridging. Match quality was stratified into full-InChIKey, InChIKey14-only, identity-conflict, and unmatchable, and all cross-source statistics were recomputed under three matching tiers (strict full-InChIKey; full + InChIKey14; and excluding identity conflicts) as a sensitivity analysis. We further matched the full official FDA DILIst dataset (1,279 drugs) against DILIrank 1.0 for a same-drug comparison. No model was retrained. Prediction-level evidence consists of the previously reproduced 223-compound held-out probability vector of the Seal et al. model and out-of-fold predictions for the 23 training-set reclassified drugs, computed with the published pipeline's own cross-validation convention (Supplementary Information, Table S2) and reported separately from the held-out predictions.</w:t>
+        <w:t xml:space="preserve"> We aligned the two U.S. FDA releases of DILIrank (1.0, n = 1,036; 2.0, n = 1,336) by LTKB identifier, and cross-matched the result against the 1,111-compound gold standard of Seal et al. (2024), the publicly released DILIPredictor benchmark, using PubChem InChIKey bridging. Match quality was stratified into full-InChIKey, InChIKey14-only, identity-conflict, and unmatchable, and all cross-source statistics were recomputed under three matching tiers (strict full-InChIKey; full + InChIKey14; and excluding identity conflicts) as a sensitivity analysis. We further matched the full official FDA DILIst dataset (1,279 drugs) against DILIrank 1.0 for a same-drug comparison. No new predictive model was developed. Previously reproduced held-out predictions and cross-validation-derived scores for the 23 reclassified training-set compounds were analyzed descriptively; the original pipeline's model-selection convention was retained and disclosed, and these scores are not presented as leakage-free nested cross-validation estimates (Supplementary Information, Tables S1–S2).</w:t>
       </w:r>
     </w:p>
     <w:p>
@@ -293,7 +293,7 @@
         <w:t>Predictions.</w:t>
       </w:r>
       <w:r>
-        <w:t xml:space="preserve"> Only the already-reproduced 223-compound held-out probability vector of the Seal et al. FeatureNet model was used (verified against the authors' published predictions to floating-point precision in earlier work; see Data availability). The Youden threshold (0.6386) is the published value reported by Seal et al. [6]; it was not refitted on the held-out set for this work. No model was trained or re-run. Out-of-fold predictions for the 23 training-set reclassified drugs use the published pipeline's own cross-validation convention — the 4-fold cross_val_predict of the selected final model that the authors themselves use for threshold selection; model selection used all 888 training labels, as in the original pipeline, and this is disclosed rather than presented as leakage-free (Table S2).</w:t>
+        <w:t xml:space="preserve"> No new predictive model was developed. Previously reproduced held-out predictions (the 223-compound probability vector of the Seal et al. FeatureNet model, verified against the authors' published predictions to floating-point precision in earlier work; see Data availability) and cross-validation-derived scores for the 23 reclassified training-set compounds were analyzed descriptively. The scores use the original pipeline's own cross-validation convention — the 4-fold cross_val_predict of the selected final model that the authors themselves use for threshold selection; model selection used all 888 training labels, as in the original pipeline, and this convention is disclosed, not presented as leakage-free nested cross-validation estimates (Table S2). The Youden threshold (0.6386) is the published value reported by Seal et al. [6]; it was not refitted on the held-out set for this work.</w:t>
       </w:r>
     </w:p>
     <w:p>

</xml_diff>

<commit_message>
Add author block (Yu Zhang, Anhui Medical University), declarations section, fill cover-letter affiliation
</commit_message>
<xml_diff>
--- a/submission_docx/manuscript.docx
+++ b/submission_docx/manuscript.docx
@@ -11,6 +11,30 @@
           <w:sz w:val="32"/>
         </w:rPr>
         <w:t>Version drift and source-dependent binary labeling of ambiguous drugs in a drug-induced liver injury benchmark: a provenance audit</w:t>
+      </w:r>
+    </w:p>
+    <w:p>
+      <w:pPr>
+        <w:spacing w:line="360" w:lineRule="auto" w:after="120"/>
+      </w:pPr>
+      <w:r>
+        <w:t>Yu Zhang</w:t>
+      </w:r>
+    </w:p>
+    <w:p>
+      <w:pPr>
+        <w:spacing w:line="360" w:lineRule="auto" w:after="120"/>
+      </w:pPr>
+      <w:r>
+        <w:t>Clinical Pharmacy Program, School of Pharmacy, Anhui Medical University, Hefei, Anhui, China</w:t>
+      </w:r>
+    </w:p>
+    <w:p>
+      <w:pPr>
+        <w:spacing w:line="360" w:lineRule="auto" w:after="120"/>
+      </w:pPr>
+      <w:r>
+        <w:t>Correspondence: mengyufanqiu@gmail.com</w:t>
       </w:r>
     </w:p>
     <w:p>
@@ -1774,6 +1798,22 @@
         <w:pStyle w:val="Heading1"/>
       </w:pPr>
       <w:r>
+        <w:t>Declarations</w:t>
+      </w:r>
+    </w:p>
+    <w:p>
+      <w:pPr>
+        <w:spacing w:line="360" w:lineRule="auto" w:after="120"/>
+      </w:pPr>
+      <w:r>
+        <w:t>Declarations of interest: none. Funding: none. This study used only public datasets and previously published data; no ethical approval was required.</w:t>
+      </w:r>
+    </w:p>
+    <w:p>
+      <w:pPr>
+        <w:pStyle w:val="Heading1"/>
+      </w:pPr>
+      <w:r>
         <w:t>Data availability</w:t>
       </w:r>
     </w:p>

</xml_diff>

<commit_message>
Round-10 editing: dual-tool AI disclosure (ChatGPT+Claude, singular author), compressed abstract, de-duplicated disclaimers, direct phrasing
</commit_message>
<xml_diff>
--- a/submission_docx/manuscript.docx
+++ b/submission_docx/manuscript.docx
@@ -70,7 +70,7 @@
         <w:t>Methods.</w:t>
       </w:r>
       <w:r>
-        <w:t xml:space="preserve"> We aligned the two U.S. FDA releases of DILIrank (1.0, n = 1,036; 2.0, n = 1,336) by LTKB identifier, and cross-matched the result against the 1,111-compound gold standard of Seal et al. (2024), the publicly released DILIPredictor benchmark, using PubChem InChIKey bridging. Match quality was stratified into full-InChIKey, InChIKey14-only, identity-conflict, and unmatchable, and all cross-source statistics were recomputed under three matching tiers (strict full-InChIKey; full + InChIKey14; and excluding identity conflicts) as a sensitivity analysis. We further matched the full official FDA DILIst dataset (1,279 drugs) against DILIrank 1.0 for a same-drug comparison. No new predictive model was developed. Previously reproduced held-out predictions and cross-validation-derived scores for the 23 reclassified training-set compounds were analyzed descriptively; the original pipeline's model-selection convention was retained and disclosed, and these scores are not presented as leakage-free nested cross-validation estimates (Supplementary Information, Tables S1–S2).</w:t>
+        <w:t xml:space="preserve"> We aligned the two U.S. FDA releases of DILIrank (1.0, n = 1,036; 2.0, n = 1,336) by LTKB identifier, cross-matched the result against the 1,111-compound gold standard of Seal et al. (2024) by PubChem InChIKey, and recomputed all cross-source statistics under three matching tiers (strict full-InChIKey; full + InChIKey14; identity conflicts excluded). The full official FDA DILIst dataset (1,279 drugs) was additionally matched against DILIrank 1.0. No new predictive model was developed; previously reproduced held-out predictions and cross-validation-derived scores for the 23 reclassified training-set compounds were analyzed descriptively under the original pipeline's convention (disclosed; Supplementary Information, Tables S1–S2).</w:t>
       </w:r>
     </w:p>
     <w:p>
@@ -84,7 +84,7 @@
         <w:t>Results.</w:t>
       </w:r>
       <w:r>
-        <w:t xml:space="preserve"> Between versions, 0 drugs were removed and 300 were added; 49 were reclassified. All 49 reclassifications ended in a defined concern category; among transitions between defined concern categories, 18 were escalations (no → less) and none were downgrades. The remaining 31 transitions resolved the ambiguous category to a defined concern category (27 to less, 4 to most). In the benchmark, among 559 DILIst-sourced compounds with a DILIrank-1.0 class, the non-ambiguous classes agree with DILIst (476/476) — an agreement that is partly definitional, because DILIst was constructed on top of DILIrank with a stated most/less→positive, no→negative rule [2], and we therefore treat it as a consistency check of that rule rather than independent corroboration. The informative pattern is the ambiguous class: in the matched ambiguous subset of the benchmark, 80 DILIrank-1.0-ambiguous drugs carry a negative label in the DILIst-sourced channel and 30 a positive label in the pre-binarized, DILIrank-derived "CP Overlap" channel; the same directional split holds under strict full-InChIKey matching (44 negative / 17 positive). In the full official DILIst dataset, 836 drugs match DILIrank 1.0 at the structure level: the non-ambiguous classes agree in 707/708 cases under strict full-InChIKey matching and 713/714 in the main analysis; the single non-agreeing case in both tiers is the norgestrel row, which reflects a DILIst-internal label split between a racemate and its enantiomer (norgestrel positive vs levonorgestrel negative — DILIrank and DILIst agree on levonorgestrel itself) rather than a same-structure cross-source conflict; excluding this identified entity-normalization anomaly, the same-entity agreement is 707/707 and 713/713. The matched ambiguous drugs carry 120 negative and 2 positive DILIst labels (norethindrone; zopiclone — skeleton-level only, not claimed as confirmed same-drug), 121 and 1 positive under strict matching; the two tiers are reported separately rather than merged. Two compounds (armodafinil, tretinoin) appear as positive DILIst-sourced rows in the benchmark but are absent from the official DILIst dataset, a source-provenance discrepancy whose cause is not attributed. Of the 49 reclassified drugs, 28 fall inside the Seal gold standard (23 train / 5 held-out); the 5 held-out drugs all carry a "less" label in version 2.0, and their reproduced DILIPredictor probabilities straddle the published Youden threshold (0.6386): 2 predicted positive, 3 negative, and all five lie within 0.22 of equiprobability.</w:t>
+        <w:t xml:space="preserve"> Between versions, 0 drugs were removed and 300 were added; 49 were reclassified. All 49 reclassifications ended in a defined concern category; among transitions between defined concern categories, 18 were escalations (no → less) and none were downgrades. The remaining 31 transitions resolved the ambiguous category to a defined concern category (27 to less, 4 to most). In the benchmark, among 559 DILIst-sourced compounds with a DILIrank-1.0 class, the non-ambiguous classes agree with DILIst (476/476) — an agreement that is partly definitional, because DILIst was constructed on top of DILIrank with a stated most/less→positive, no→negative rule [2], and we therefore treat it as a consistency check of that rule rather than independent corroboration. Among the matched ambiguous compounds: in the matched ambiguous subset of the benchmark, 80 DILIrank-1.0-ambiguous drugs carry a negative label in the DILIst-sourced channel and 30 a positive label in the pre-binarized, DILIrank-derived "CP Overlap" channel; the same directional split holds under strict full-InChIKey matching (44 negative / 17 positive). In the full official DILIst dataset, 836 drugs match DILIrank 1.0 at the structure level: the non-ambiguous classes agree in 707/708 cases under strict full-InChIKey matching and 713/714 in the main analysis; the single non-agreeing case in both tiers is the norgestrel row, which reflects a DILIst-internal label split between a racemate and its enantiomer (norgestrel positive vs levonorgestrel negative — DILIrank and DILIst agree on levonorgestrel itself) rather than a same-structure cross-source conflict; excluding this identified entity-normalization anomaly, the same-entity agreement is 707/707 and 713/713. The matched ambiguous drugs carry 120 negative and 2 positive DILIst labels (norethindrone; zopiclone — skeleton-level only, not claimed as confirmed same-drug), 121 and 1 positive under strict matching; the two tiers are reported separately rather than merged. Two compounds (armodafinil, tretinoin) appear as positive DILIst-sourced rows in the benchmark but are absent from the official DILIst dataset, a source-provenance discrepancy whose cause is not attributed. Of the 49 reclassified drugs, 28 fall inside the Seal gold standard (23 train / 5 held-out); the 5 held-out drugs all carry a "less" label in version 2.0, and their reproduced DILIPredictor probabilities straddle the published Youden threshold (0.6386): 2 predicted positive, 3 negative, and all five lie within 0.22 of equiprobability.</w:t>
       </w:r>
     </w:p>
     <w:p>
@@ -98,7 +98,7 @@
         <w:t>Conclusions.</w:t>
       </w:r>
       <w:r>
-        <w:t xml:space="preserve"> DILI reference-label instability is concentrated in the epistemically uncertain class and is directional in three senses: all 49 reclassifications ended in a defined concern category (18 escalations and no downgrades among defined-class transitions); in a widely used shipped benchmark the ambiguous class carries binary labels that differ in direction between two disjoint source channels; and in the full official DILIst dataset the ambiguous class is labeled negative for 120 of 122 same-drug matched cases, with two named exceptions (one under strict matching). The benchmark's DILIst-sourced rows and the official DILIst dataset are not the same object, and two benchmark rows have no counterpart in the official dataset (a source-provenance discrepancy). These are descriptive properties of the shipped data, not claims about label correctness. Benchmarks should treat the ambiguous class explicitly and report per-drug label provenance instead of silently merging or discarding it. The small number of reclassified held-out compounds (n = 5; n = 2 under strict matching) limits this work to a descriptive audit; larger out-of-fold samples would be needed for inferential claims about model behaviour.</w:t>
+        <w:t xml:space="preserve"> DILI reference-label instability is concentrated in the ambiguous class and is directional: the 1.0→2.0 update moved drugs only into defined concern categories, and the ambiguous class is labeled negative in the full DILIst dataset (120/122) yet carries binary labels of opposite direction across the benchmark's two disjoint channels. These are descriptive properties of the shipped data, not claims about label correctness. Benchmarks should treat the ambiguous class explicitly and record per-drug label provenance.</w:t>
       </w:r>
     </w:p>
     <w:p>
@@ -148,7 +148,7 @@
         <w:spacing w:line="360" w:lineRule="auto" w:after="120"/>
       </w:pPr>
       <w:r>
-        <w:t>Here we do not build a new database or a new predictor. We audit the labels themselves: (i) how many drugs changed class between DILIrank 1.0 and 2.0, and in which direction; (ii) how compounds classified as ambiguous in DILIrank 1.0 carry binary labels across two disjoint source channels in a published benchmark — the Seal et al. (2024) gold standard [6] — and how the resulting label distribution depends on source provenance; (iii) how the same drugs are labeled in the full official DILIst dataset, as a same-drug comparison rather than a channel-level comparison; and (iv) what the reclassified compounds that survive into that benchmark's held-out set look like under the reproduced model. Prior work has examined how the choice of features, endpoints, and negative-sample definitions affects reported DILI model performance [7], and i-DILI's binarized overlap comparison drops the ambiguous class [4]; to our knowledge, the direction of the 1.0→2.0 reclassification (preserving the four-category semantics) and the source-dependent binary labeling of the ambiguous class have not been quantified. Our contribution is limited to checkable, quantitative facts about label provenance — the directionally asymmetric reclassification pattern of the 1.0→2.0 update, the specific path by which compounds classified as ambiguous in DILIrank 1.0 arrive in a published benchmark with binary labels, and the same-drug label correspondence between DILIrank 1.0 and the full DILIst dataset — reported as a descriptive, reproducible characterization that supports "benchmark hygiene" decisions, not a claim of improved prediction.</w:t>
+        <w:t>Here we do not build a new database or a new predictor. We audit the labels themselves: (i) how many drugs changed class between DILIrank 1.0 and 2.0, and in which direction; (ii) how compounds classified as ambiguous in DILIrank 1.0 carry binary labels across two disjoint source channels in a published benchmark — the Seal et al. (2024) gold standard [6] — and how the resulting label distribution depends on source provenance; (iii) how the same drugs are labeled in the full official DILIst dataset, as a same-drug comparison rather than a channel-level comparison; and (iv) what the reclassified compounds that survive into that benchmark's held-out set look like under the reproduced model. Prior work has examined how the choice of features, endpoints, and negative-sample definitions affects reported DILI model performance [7], and i-DILI's binarized overlap comparison drops the ambiguous class [4]; to our knowledge, the direction of the 1.0→2.0 reclassification (preserving the four-category semantics) and the source-dependent binary labeling of the ambiguous class have not been quantified. We report three checkable quantities: the directionally asymmetric reclassification pattern of the 1.0→2.0 update; the source-dependent binary labels that compounds classified as ambiguous in DILIrank 1.0 carry in a published benchmark; and the same-drug label correspondence between DILIrank 1.0 and the full official DILIst dataset. The analysis is descriptive and reproducible, and no claim of improved prediction is made.</w:t>
       </w:r>
     </w:p>
     <w:p>
@@ -331,7 +331,7 @@
         <w:t>Generative AI use.</w:t>
       </w:r>
       <w:r>
-        <w:t xml:space="preserve"> Generative AI (Claude, Anthropic) was used during the preparation of this work: to assist research positioning and literature review, to draft and revise manuscript text across multiple versions, for language editing, and to generate and debug the reproduction and analysis scripts (`repro/generate_analysis.py`, `repro/full_dilist_comparison.py`, `repro/make_figures.py`, and the document converter). The audit design and its analytical decisions were developed through iterative expert reviews of successive drafts, with every finding verified by the authors against local data and public sources before inclusion. All data, all numerical results, and all analyses were produced by the authors' own scripts; the authors reviewed every claim in the final text and take full responsibility for the content.</w:t>
+        <w:t xml:space="preserve"> Generative AI tools were used during the preparation of this work: ChatGPT (OpenAI) assisted research positioning, literature discussion, and iterative manuscript review and revision; Claude (Anthropic) assisted drafting and revising manuscript text, language editing, and the generation and debugging of the reproduction and analysis scripts (`repro/generate_analysis.py`, `repro/full_dilist_comparison.py`, `repro/make_figures.py`, and the document converter). The study design and analytical decisions were refined through iterative review of successive drafts. The author verified every reported finding against the source data and analysis outputs and takes responsibility for the final manuscript.</w:t>
       </w:r>
     </w:p>
     <w:p>
@@ -1744,7 +1744,7 @@
         <w:spacing w:line="360" w:lineRule="auto" w:after="120"/>
       </w:pPr>
       <w:r>
-        <w:t>Our findings are complementary to, and deliberately narrower than, i-DILI [4], which harmonizes seven sources into one binary label with a confidence score, reports kappa = 0.888 over 480 shared drugs under a most/less→positive, no→negative binarization that drops the ambiguous class, and uses only DILIrank 2.0; and StateFlux [5], which used the 300 added drugs as a temporal test for feature representations. Our 836 matched drugs and i-DILI's 480 shared drugs are not directly comparable counts: i-DILI derives labels from DILIrank 2.0 with an ambiguous-excluding binarization, whereas we matched the full official DILIst workbook against DILIrank 1.0 by structure while preserving the four classes (Table S3). The difference reflects design choices, not a contradiction, and we do not present it as evidence of novelty. A same-journal study systematically evaluated how generic curation steps, stereochemical handling, and label-conflict policies across 12 toxicity and ADME endpoints alter modeling data and model performance [10]. Its object is the curation pipeline for QSAR modeling across endpoints; ours is the version drift and source-dependent labeling of one DILI-specific reference-label system, without any model-performance claims. We therefore do not claim that label provenance matters or that stereochemical matching can change results as novel points — those are established [10]; our contribution is the specific, checkable accounting for the DILI reference labels. We do not claim i-DILI, StateFlux, or [10] are incomplete; we claim checkable, quantitative facts about label provenance that neither reports: the directionally asymmetric reclassification pattern of the 1.0→2.0 update, the specific path by which compounds classified as ambiguous in DILIrank 1.0 arrive in a published benchmark with binary labels, and the same-drug label correspondence between DILIrank 1.0 and the full official DILIst dataset. All remain descriptive statements about data provenance; they do not require, and we do not offer, a claim that any benchmark's labels are wrong or that any model's performance is misreported.</w:t>
+        <w:t>i-DILI [4] harmonizes seven sources into one binary label with a confidence score, reports kappa = 0.888 over 480 shared drugs under a most/less→positive, no→negative binarization that drops the ambiguous class, and uses only DILIrank 2.0. StateFlux [5] used the 300 added drugs as a temporal test for feature representations. Our 836 matched drugs and i-DILI's 480 shared drugs are not directly comparable counts: i-DILI derives labels from DILIrank 2.0 with an ambiguous-excluding binarization, whereas we matched the full official DILIst workbook against DILIrank 1.0 by structure while preserving the four classes (Table S3). The difference reflects design choices, not a contradiction, and we do not present it as evidence of novelty. A same-journal study systematically evaluated how generic curation steps, stereochemical handling, and label-conflict policies across 12 toxicity and ADME endpoints alter modeling data and model performance [10]. Its object is the curation pipeline for QSAR modeling across endpoints; the present audit addresses the version drift and source-dependent labeling of one DILI-specific reference-label system, without model-performance claims. Label-provenance effects and stereochemical-matching effects are therefore treated as established [10]; what is reported here is the specific accounting for the DILI reference labels — the directionally asymmetric reclassification pattern, the path by which ambiguous compounds arrive in a published benchmark with binary labels, and the same-drug label correspondence between DILIrank 1.0 and the full official DILIst dataset.</w:t>
       </w:r>
     </w:p>
     <w:p>
@@ -1790,7 +1790,7 @@
         <w:t>Benchmark-hygiene recommendation.</w:t>
       </w:r>
       <w:r>
-        <w:t xml:space="preserve"> When compiling or reusing a DILI benchmark: keep the ambiguous class as a third state (or an explicit exclusion flag with a recorded direction), report per-drug label provenance, re-check version alignment before reporting model performance, and audit the shipped labels against the benchmark's stated label policy, recording any undocumented upstream binarization steps (here: the "CP Overlap" subset, whose rule is not documented in the repository) and any divergence between the shipped snapshot and the official source dataset it names (here: armodafinil and tretinoin). These are inexpensive steps that prevent label instability from being mistaken for model error.</w:t>
+        <w:t xml:space="preserve"> When compiling or reusing a DILI benchmark: keep the ambiguous class as a third state (or an explicit exclusion flag with a recorded direction), report per-drug label provenance, re-check version alignment before reporting model performance, and audit the shipped labels against the benchmark's stated label policy, recording any undocumented upstream binarization steps (here: the "CP Overlap" subset, whose rule is not documented in the repository) and any divergence between the shipped snapshot and the official source dataset it names (here: armodafinil and tretinoin). These checks may help identify label discrepancies before model evaluation.</w:t>
       </w:r>
     </w:p>
     <w:p>

</xml_diff>

<commit_message>
Guide compliance: 237-word abstract, keywords, journal-style GenAI declaration section, standard COI/funding sentences, corresponding-author line, 330-dpi figures (2265px), highlights and declarations files, checklist compliance section
</commit_message>
<xml_diff>
--- a/submission_docx/manuscript.docx
+++ b/submission_docx/manuscript.docx
@@ -34,7 +34,7 @@
         <w:spacing w:line="360" w:lineRule="auto" w:after="120"/>
       </w:pPr>
       <w:r>
-        <w:t>Correspondence: mengyufanqiu@gmail.com</w:t>
+        <w:t>Corresponding author: Yu Zhang, mengyufanqiu@gmail.com</w:t>
       </w:r>
     </w:p>
     <w:p>
@@ -56,7 +56,7 @@
         <w:t>Background.</w:t>
       </w:r>
       <w:r>
-        <w:t xml:space="preserve"> Machine-learning models for drug-induced liver injury (DILI) are trained and benchmarked against reference labels compiled from heterogeneous sources whose evidence rules differ and which are periodically revised. If reference labels are unstable, the target a model is asked to predict — and the meaning of its reported performance — can drift without any change to the model itself. This instability is rarely quantified before training.</w:t>
+        <w:t xml:space="preserve"> Machine-learning models for drug-induced liver injury (DILI) are trained and benchmarked against reference labels compiled from heterogeneous, periodically revised sources. If labels drift, the meaning of reported performance drifts with them; this instability is rarely quantified.</w:t>
       </w:r>
     </w:p>
     <w:p>
@@ -70,7 +70,7 @@
         <w:t>Methods.</w:t>
       </w:r>
       <w:r>
-        <w:t xml:space="preserve"> We aligned the two U.S. FDA releases of DILIrank (1.0, n = 1,036; 2.0, n = 1,336) by LTKB identifier, cross-matched the result against the 1,111-compound gold standard of Seal et al. (2024) by PubChem InChIKey, and recomputed all cross-source statistics under three matching tiers (strict full-InChIKey; full + InChIKey14; identity conflicts excluded). The full official FDA DILIst dataset (1,279 drugs) was additionally matched against DILIrank 1.0. No new predictive model was developed; previously reproduced held-out predictions and cross-validation-derived scores for the 23 reclassified training-set compounds were analyzed descriptively under the original pipeline's convention (disclosed; Supplementary Information, Tables S1–S2).</w:t>
+        <w:t xml:space="preserve"> We aligned the two FDA releases of DILIrank (1.0, n = 1,036; 2.0, n = 1,336) by LTKB identifier, cross-matched them against the Seal et al. (2024) benchmark by PubChem InChIKey under three matching tiers, and matched the full official DILIst dataset (1,279 drugs) against DILIrank 1.0. No new predictive model was developed.</w:t>
       </w:r>
     </w:p>
     <w:p>
@@ -84,7 +84,7 @@
         <w:t>Results.</w:t>
       </w:r>
       <w:r>
-        <w:t xml:space="preserve"> Between versions, 0 drugs were removed and 300 were added; 49 were reclassified. All 49 reclassifications ended in a defined concern category; among transitions between defined concern categories, 18 were escalations (no → less) and none were downgrades. The remaining 31 transitions resolved the ambiguous category to a defined concern category (27 to less, 4 to most). In the benchmark, among 559 DILIst-sourced compounds with a DILIrank-1.0 class, the non-ambiguous classes agree with DILIst (476/476) — an agreement that is partly definitional, because DILIst was constructed on top of DILIrank with a stated most/less→positive, no→negative rule [2], and we therefore treat it as a consistency check of that rule rather than independent corroboration. Among the matched ambiguous compounds: in the matched ambiguous subset of the benchmark, 80 DILIrank-1.0-ambiguous drugs carry a negative label in the DILIst-sourced channel and 30 a positive label in the pre-binarized, DILIrank-derived "CP Overlap" channel; the same directional split holds under strict full-InChIKey matching (44 negative / 17 positive). In the full official DILIst dataset, 836 drugs match DILIrank 1.0 at the structure level: the non-ambiguous classes agree in 707/708 cases under strict full-InChIKey matching and 713/714 in the main analysis; the single non-agreeing case in both tiers is the norgestrel row, which reflects a DILIst-internal label split between a racemate and its enantiomer (norgestrel positive vs levonorgestrel negative — DILIrank and DILIst agree on levonorgestrel itself) rather than a same-structure cross-source conflict; excluding this identified entity-normalization anomaly, the same-entity agreement is 707/707 and 713/713. The matched ambiguous drugs carry 120 negative and 2 positive DILIst labels (norethindrone; zopiclone — skeleton-level only, not claimed as confirmed same-drug), 121 and 1 positive under strict matching; the two tiers are reported separately rather than merged. Two compounds (armodafinil, tretinoin) appear as positive DILIst-sourced rows in the benchmark but are absent from the official DILIst dataset, a source-provenance discrepancy whose cause is not attributed. Of the 49 reclassified drugs, 28 fall inside the Seal gold standard (23 train / 5 held-out); the 5 held-out drugs all carry a "less" label in version 2.0, and their reproduced DILIPredictor probabilities straddle the published Youden threshold (0.6386): 2 predicted positive, 3 negative, and all five lie within 0.22 of equiprobability.</w:t>
+        <w:t xml:space="preserve"> Between versions, 0 drugs were removed and 300 were added; all 49 reclassifications ended in defined concern categories (18 escalations, 31 resolutions of classification uncertainty, no downgrades). In the benchmark, all 110 tallied ambiguous compounds carry binary labels: 80 negative in the DILIst-sourced channel and 30 positive in the pre-binarized DILIrank-derived subset, two disjoint drug sets (44/17 under strict matching). In the full DILIst dataset, the ambiguous class is negative in 120 of 122 matched cases, with two exceptions; two benchmark rows (armodafinil, tretinoin) have no counterpart in the official dataset.</w:t>
       </w:r>
     </w:p>
     <w:p>
@@ -98,7 +98,29 @@
         <w:t>Conclusions.</w:t>
       </w:r>
       <w:r>
-        <w:t xml:space="preserve"> DILI reference-label instability is concentrated in the ambiguous class and is directional: the 1.0→2.0 update moved drugs only into defined concern categories, and the ambiguous class is labeled negative in the full DILIst dataset (120/122) yet carries binary labels of opposite direction across the benchmark's two disjoint channels. These are descriptive properties of the shipped data, not claims about label correctness. Benchmarks should treat the ambiguous class explicitly and record per-drug label provenance.</w:t>
+        <w:t xml:space="preserve"> Reference-label instability is concentrated in the ambiguous class and is directional: the update moved drugs only into defined categories, and the ambiguous class carries opposite binary labels across the benchmark's two channels while being overwhelmingly negative in DILIst. Benchmarks should treat the ambiguous class explicitly and record per-drug label provenance.</w:t>
+      </w:r>
+    </w:p>
+    <w:p>
+      <w:pPr>
+        <w:spacing w:line="360" w:lineRule="auto" w:after="120"/>
+      </w:pPr>
+      <w:r>
+        <w:rPr>
+          <w:b/>
+        </w:rPr>
+        <w:t>Keywords.</w:t>
+      </w:r>
+      <w:r>
+        <w:t xml:space="preserve"> drug-induced liver injury; benchmark; label provenance; DILIrank; DILIst; ambiguous; data curation</w:t>
+      </w:r>
+    </w:p>
+    <w:p>
+      <w:pPr>
+        <w:spacing w:line="360" w:lineRule="auto" w:after="120"/>
+      </w:pPr>
+      <w:r>
+        <w:t>and is directional: the update moved drugs only into defined categories, and the ambiguous class carries opposite binary labels across the benchmark's two channels while being overwhelmingly negative in DILIst. Benchmarks should treat the ambiguous class explicitly and record per-drug label provenance.</w:t>
       </w:r>
     </w:p>
     <w:p>
@@ -318,20 +340,6 @@
       </w:r>
       <w:r>
         <w:t xml:space="preserve"> No new predictive model was developed. Previously reproduced held-out predictions (the 223-compound probability vector of the Seal et al. FeatureNet model, verified against the authors' published predictions to floating-point precision in earlier work; see Data availability) and cross-validation-derived scores for the 23 reclassified training-set compounds were analyzed descriptively. The scores use the original pipeline's own cross-validation convention — the 4-fold cross_val_predict of the selected final model that the authors themselves use for threshold selection; model selection used all 888 training labels, as in the original pipeline, and this convention is disclosed, not presented as leakage-free nested cross-validation estimates (Table S2). The Youden threshold (0.6386) is the published value reported by Seal et al. [6]; it was not refitted on the held-out set for this work.</w:t>
-      </w:r>
-    </w:p>
-    <w:p>
-      <w:pPr>
-        <w:spacing w:line="360" w:lineRule="auto" w:after="120"/>
-      </w:pPr>
-      <w:r>
-        <w:rPr>
-          <w:b/>
-        </w:rPr>
-        <w:t>Generative AI use.</w:t>
-      </w:r>
-      <w:r>
-        <w:t xml:space="preserve"> Generative AI tools were used during the preparation of this work: ChatGPT (OpenAI) assisted research positioning, literature discussion, and iterative manuscript review and revision; Claude (Anthropic) assisted drafting and revising manuscript text, language editing, and the generation and debugging of the reproduction and analysis scripts (`repro/generate_analysis.py`, `repro/full_dilist_comparison.py`, `repro/make_figures.py`, and the document converter). The study design and analytical decisions were refined through iterative review of successive drafts. The author verified every reported finding against the source data and analysis outputs and takes responsibility for the final manuscript.</w:t>
       </w:r>
     </w:p>
     <w:p>
@@ -1806,7 +1814,23 @@
         <w:spacing w:line="360" w:lineRule="auto" w:after="120"/>
       </w:pPr>
       <w:r>
-        <w:t>Declarations of interest: none. Funding: none. This study used only public datasets and previously published data; no ethical approval was required.</w:t>
+        <w:t>The author declares that he has no known competing financial interests or personal relationships that could have appeared to influence the work reported in this paper.</w:t>
+      </w:r>
+    </w:p>
+    <w:p>
+      <w:pPr>
+        <w:spacing w:line="360" w:lineRule="auto" w:after="120"/>
+      </w:pPr>
+      <w:r>
+        <w:t>This research did not receive any specific grant from funding agencies in the public, commercial, or not-for-profit sectors.</w:t>
+      </w:r>
+    </w:p>
+    <w:p>
+      <w:pPr>
+        <w:spacing w:line="360" w:lineRule="auto" w:after="120"/>
+      </w:pPr>
+      <w:r>
+        <w:t>This study used only public datasets and previously published data; no ethical approval was required.</w:t>
       </w:r>
     </w:p>
     <w:p>
@@ -1823,6 +1847,22 @@
       </w:pPr>
       <w:r>
         <w:t>The full per-drug match table (Tier B; all matched drugs with class, channel, toxicity, match tier, and conflict flag), the 49-row reclassification table, the sensitivity summary, the full-DILIst per-drug match table and agreement matrices, the PubChem lookup records for the 455 additional DILIst names (including salt-stripped variants and no-hit names), and an input manifest (paths, sizes, sha256, sources) are generated by `repro/generate_analysis.py` and `repro/full_dilist_comparison.py` (Python 3.10, pandas) from the raw inputs listed in the manifest, and are provided in `repro_outputs/`. The per-drug alignment table for the 49 reclassified drugs is provided as `data/D2_label_stability_alignment.csv` in the repository. A versioned public repository is available at https://github.com/mengyufanqiu-maker/-dili-label-provenance-audit. DILIrank versions and the DILIst dataset are the official FDA workbooks (FDA DILIrank 2.0 and DILIst dataset pages); the Seal et al. gold standard and split files are from the authors' public repository [6]; the held-out probability vector and the 0.6386 Youden threshold come from our earlier reproduction of the Seal et al. pipeline, verified against the authors' published predictions. Tables S1–S3 are in the Supplementary Information.</w:t>
+      </w:r>
+    </w:p>
+    <w:p>
+      <w:pPr>
+        <w:pStyle w:val="Heading1"/>
+      </w:pPr>
+      <w:r>
+        <w:t>Declaration of generative AI and AI-assisted technologies in the writing process</w:t>
+      </w:r>
+    </w:p>
+    <w:p>
+      <w:pPr>
+        <w:spacing w:line="360" w:lineRule="auto" w:after="120"/>
+      </w:pPr>
+      <w:r>
+        <w:t>During the preparation of this work the author used ChatGPT (OpenAI) for research positioning, literature discussion, and iterative manuscript review and revision, and Claude (Anthropic) for drafting and revising the manuscript text, language editing, and the generation and debugging of the reproduction and analysis scripts. After using these tools, the author reviewed and edited the content as needed and takes full responsibility for the content of the published article.</w:t>
       </w:r>
     </w:p>
     <w:p>

</xml_diff>